<commit_message>
Refactor chapter contents and update references
- Updated the publication details and added supplementary material links in Chapters 05.04 and 05.05.
- Adjusted section numbering and labels in Chapter 05.05 for consistency.
- Added new references for recent publications in the bibliography.
- Improved formatting in the title page for better readability.
- Corrected page numbers and section references across multiple chapters.
- Enhanced clarity in the abstract and introduction sections of Chapter 05.05.
</commit_message>
<xml_diff>
--- a/title_page/title_page.docx
+++ b/title_page/title_page.docx
@@ -235,7 +235,7 @@
                                                 <pic:cNvPicPr/>
                                               </pic:nvPicPr>
                                               <pic:blipFill>
-                                                <a:blip r:embed="rId7">
+                                                <a:blip r:embed="rId6">
                                                   <a:extLst>
                                                     <a:ext uri="{28A0092B-C50C-407E-A947-70E740481C1C}">
                                                       <a14:useLocalDpi xmlns:a14="http://schemas.microsoft.com/office/drawing/2010/main" val="0"/>
@@ -308,7 +308,7 @@
                                           <pic:cNvPicPr/>
                                         </pic:nvPicPr>
                                         <pic:blipFill>
-                                          <a:blip r:embed="rId7">
+                                          <a:blip r:embed="rId6">
                                             <a:extLst>
                                               <a:ext uri="{28A0092B-C50C-407E-A947-70E740481C1C}">
                                                 <a14:useLocalDpi xmlns:a14="http://schemas.microsoft.com/office/drawing/2010/main" val="0"/>
@@ -597,6 +597,14 @@
                                   <w:r>
                                     <w:rPr>
                                       <w:rFonts w:ascii="Arial" w:hAnsi="Arial" w:cs="Arial"/>
+                                      <w:sz w:val="20"/>
+                                      <w:szCs w:val="20"/>
+                                    </w:rPr>
+                                    <w:t xml:space="preserve">                          </w:t>
+                                  </w:r>
+                                  <w:r>
+                                    <w:rPr>
+                                      <w:rFonts w:ascii="Arial" w:hAnsi="Arial" w:cs="Arial"/>
                                       <w:b/>
                                       <w:bCs/>
                                       <w:sz w:val="20"/>
@@ -660,6 +668,14 @@
                                   <w:r>
                                     <w:rPr>
                                       <w:rFonts w:ascii="Arial" w:hAnsi="Arial" w:cs="Arial"/>
+                                      <w:sz w:val="20"/>
+                                      <w:szCs w:val="20"/>
+                                    </w:rPr>
+                                    <w:t xml:space="preserve">                     </w:t>
+                                  </w:r>
+                                  <w:r>
+                                    <w:rPr>
+                                      <w:rFonts w:ascii="Arial" w:hAnsi="Arial" w:cs="Arial"/>
                                       <w:b/>
                                       <w:bCs/>
                                       <w:sz w:val="20"/>
@@ -701,6 +717,14 @@
                                       <w:szCs w:val="20"/>
                                     </w:rPr>
                                     <w:t xml:space="preserve">Co-supervisor: </w:t>
+                                  </w:r>
+                                  <w:r>
+                                    <w:rPr>
+                                      <w:rFonts w:ascii="Arial" w:hAnsi="Arial" w:cs="Arial"/>
+                                      <w:sz w:val="20"/>
+                                      <w:szCs w:val="20"/>
+                                    </w:rPr>
+                                    <w:t xml:space="preserve">                     </w:t>
                                   </w:r>
                                   <w:r>
                                     <w:rPr>
@@ -857,6 +881,14 @@
                                   <w:r>
                                     <w:rPr>
                                       <w:rFonts w:ascii="Arial" w:hAnsi="Arial" w:cs="Arial"/>
+                                      <w:sz w:val="20"/>
+                                      <w:szCs w:val="20"/>
+                                    </w:rPr>
+                                    <w:t xml:space="preserve">           </w:t>
+                                  </w:r>
+                                  <w:r>
+                                    <w:rPr>
+                                      <w:rFonts w:ascii="Arial" w:hAnsi="Arial" w:cs="Arial"/>
                                       <w:b/>
                                       <w:bCs/>
                                       <w:sz w:val="20"/>
@@ -908,6 +940,14 @@
                                       <w:szCs w:val="20"/>
                                     </w:rPr>
                                     <w:t xml:space="preserve">: </w:t>
+                                  </w:r>
+                                  <w:r>
+                                    <w:rPr>
+                                      <w:rFonts w:ascii="Arial" w:hAnsi="Arial" w:cs="Arial"/>
+                                      <w:sz w:val="20"/>
+                                      <w:szCs w:val="20"/>
+                                    </w:rPr>
+                                    <w:t xml:space="preserve">                     </w:t>
                                   </w:r>
                                   <w:r>
                                     <w:rPr>
@@ -959,6 +999,16 @@
                                       <w:sz w:val="20"/>
                                       <w:szCs w:val="20"/>
                                     </w:rPr>
+                                    <w:t xml:space="preserve">                     </w:t>
+                                  </w:r>
+                                  <w:r>
+                                    <w:rPr>
+                                      <w:rFonts w:ascii="Arial" w:hAnsi="Arial" w:cs="Arial"/>
+                                      <w:b/>
+                                      <w:bCs/>
+                                      <w:sz w:val="20"/>
+                                      <w:szCs w:val="20"/>
+                                    </w:rPr>
                                     <w:t>P</w:t>
                                   </w:r>
                                   <w:r>
@@ -981,6 +1031,7 @@
                                       <w:bCs/>
                                       <w:sz w:val="20"/>
                                       <w:szCs w:val="20"/>
+                                      <w:lang w:val="nl-BE"/>
                                     </w:rPr>
                                   </w:pPr>
                                   <w:r>
@@ -990,8 +1041,31 @@
                                       <w:bCs/>
                                       <w:sz w:val="20"/>
                                       <w:szCs w:val="20"/>
-                                    </w:rPr>
-                                    <w:t xml:space="preserve">  Prof. Celine Vens</w:t>
+                                      <w:lang w:val="nl-BE"/>
+                                    </w:rPr>
+                                    <w:t xml:space="preserve">  </w:t>
+                                  </w:r>
+                                  <w:r>
+                                    <w:rPr>
+                                      <w:rFonts w:ascii="Arial" w:hAnsi="Arial" w:cs="Arial"/>
+                                      <w:b/>
+                                      <w:bCs/>
+                                      <w:sz w:val="20"/>
+                                      <w:szCs w:val="20"/>
+                                      <w:lang w:val="nl-BE"/>
+                                    </w:rPr>
+                                    <w:t xml:space="preserve">                     </w:t>
+                                  </w:r>
+                                  <w:r>
+                                    <w:rPr>
+                                      <w:rFonts w:ascii="Arial" w:hAnsi="Arial" w:cs="Arial"/>
+                                      <w:b/>
+                                      <w:bCs/>
+                                      <w:sz w:val="20"/>
+                                      <w:szCs w:val="20"/>
+                                      <w:lang w:val="nl-BE"/>
+                                    </w:rPr>
+                                    <w:t>Prof. Celine Vens</w:t>
                                   </w:r>
                                 </w:p>
                                 <w:p>
@@ -1003,6 +1077,7 @@
                                       <w:bCs/>
                                       <w:sz w:val="20"/>
                                       <w:szCs w:val="20"/>
+                                      <w:lang w:val="nl-BE"/>
                                     </w:rPr>
                                   </w:pPr>
                                   <w:r>
@@ -1012,8 +1087,42 @@
                                       <w:bCs/>
                                       <w:sz w:val="20"/>
                                       <w:szCs w:val="20"/>
-                                    </w:rPr>
-                                    <w:t xml:space="preserve">  Prof. Thierry Van den Bosch</w:t>
+                                      <w:lang w:val="nl-BE"/>
+                                    </w:rPr>
+                                    <w:t xml:space="preserve">  </w:t>
+                                  </w:r>
+                                  <w:r>
+                                    <w:rPr>
+                                      <w:rFonts w:ascii="Arial" w:hAnsi="Arial" w:cs="Arial"/>
+                                      <w:b/>
+                                      <w:bCs/>
+                                      <w:sz w:val="20"/>
+                                      <w:szCs w:val="20"/>
+                                      <w:lang w:val="nl-BE"/>
+                                    </w:rPr>
+                                    <w:t xml:space="preserve"> </w:t>
+                                  </w:r>
+                                  <w:r>
+                                    <w:rPr>
+                                      <w:rFonts w:ascii="Arial" w:hAnsi="Arial" w:cs="Arial"/>
+                                      <w:b/>
+                                      <w:bCs/>
+                                      <w:sz w:val="20"/>
+                                      <w:szCs w:val="20"/>
+                                      <w:lang w:val="nl-BE"/>
+                                    </w:rPr>
+                                    <w:t xml:space="preserve">                    </w:t>
+                                  </w:r>
+                                  <w:r>
+                                    <w:rPr>
+                                      <w:rFonts w:ascii="Arial" w:hAnsi="Arial" w:cs="Arial"/>
+                                      <w:b/>
+                                      <w:bCs/>
+                                      <w:sz w:val="20"/>
+                                      <w:szCs w:val="20"/>
+                                      <w:lang w:val="nl-BE"/>
+                                    </w:rPr>
+                                    <w:t>Prof. Thierry Van den Bosch</w:t>
                                   </w:r>
                                 </w:p>
                               </w:txbxContent>
@@ -1108,6 +1217,14 @@
                             <w:r>
                               <w:rPr>
                                 <w:rFonts w:ascii="Arial" w:hAnsi="Arial" w:cs="Arial"/>
+                                <w:sz w:val="20"/>
+                                <w:szCs w:val="20"/>
+                              </w:rPr>
+                              <w:t xml:space="preserve">                          </w:t>
+                            </w:r>
+                            <w:r>
+                              <w:rPr>
+                                <w:rFonts w:ascii="Arial" w:hAnsi="Arial" w:cs="Arial"/>
                                 <w:b/>
                                 <w:bCs/>
                                 <w:sz w:val="20"/>
@@ -1171,6 +1288,14 @@
                             <w:r>
                               <w:rPr>
                                 <w:rFonts w:ascii="Arial" w:hAnsi="Arial" w:cs="Arial"/>
+                                <w:sz w:val="20"/>
+                                <w:szCs w:val="20"/>
+                              </w:rPr>
+                              <w:t xml:space="preserve">                     </w:t>
+                            </w:r>
+                            <w:r>
+                              <w:rPr>
+                                <w:rFonts w:ascii="Arial" w:hAnsi="Arial" w:cs="Arial"/>
                                 <w:b/>
                                 <w:bCs/>
                                 <w:sz w:val="20"/>
@@ -1212,6 +1337,14 @@
                                 <w:szCs w:val="20"/>
                               </w:rPr>
                               <w:t xml:space="preserve">Co-supervisor: </w:t>
+                            </w:r>
+                            <w:r>
+                              <w:rPr>
+                                <w:rFonts w:ascii="Arial" w:hAnsi="Arial" w:cs="Arial"/>
+                                <w:sz w:val="20"/>
+                                <w:szCs w:val="20"/>
+                              </w:rPr>
+                              <w:t xml:space="preserve">                     </w:t>
                             </w:r>
                             <w:r>
                               <w:rPr>
@@ -1368,6 +1501,14 @@
                             <w:r>
                               <w:rPr>
                                 <w:rFonts w:ascii="Arial" w:hAnsi="Arial" w:cs="Arial"/>
+                                <w:sz w:val="20"/>
+                                <w:szCs w:val="20"/>
+                              </w:rPr>
+                              <w:t xml:space="preserve">           </w:t>
+                            </w:r>
+                            <w:r>
+                              <w:rPr>
+                                <w:rFonts w:ascii="Arial" w:hAnsi="Arial" w:cs="Arial"/>
                                 <w:b/>
                                 <w:bCs/>
                                 <w:sz w:val="20"/>
@@ -1419,6 +1560,14 @@
                                 <w:szCs w:val="20"/>
                               </w:rPr>
                               <w:t xml:space="preserve">: </w:t>
+                            </w:r>
+                            <w:r>
+                              <w:rPr>
+                                <w:rFonts w:ascii="Arial" w:hAnsi="Arial" w:cs="Arial"/>
+                                <w:sz w:val="20"/>
+                                <w:szCs w:val="20"/>
+                              </w:rPr>
+                              <w:t xml:space="preserve">                     </w:t>
                             </w:r>
                             <w:r>
                               <w:rPr>
@@ -1470,6 +1619,16 @@
                                 <w:sz w:val="20"/>
                                 <w:szCs w:val="20"/>
                               </w:rPr>
+                              <w:t xml:space="preserve">                     </w:t>
+                            </w:r>
+                            <w:r>
+                              <w:rPr>
+                                <w:rFonts w:ascii="Arial" w:hAnsi="Arial" w:cs="Arial"/>
+                                <w:b/>
+                                <w:bCs/>
+                                <w:sz w:val="20"/>
+                                <w:szCs w:val="20"/>
+                              </w:rPr>
                               <w:t>P</w:t>
                             </w:r>
                             <w:r>
@@ -1492,6 +1651,7 @@
                                 <w:bCs/>
                                 <w:sz w:val="20"/>
                                 <w:szCs w:val="20"/>
+                                <w:lang w:val="nl-BE"/>
                               </w:rPr>
                             </w:pPr>
                             <w:r>
@@ -1501,8 +1661,31 @@
                                 <w:bCs/>
                                 <w:sz w:val="20"/>
                                 <w:szCs w:val="20"/>
-                              </w:rPr>
-                              <w:t xml:space="preserve">  Prof. Celine Vens</w:t>
+                                <w:lang w:val="nl-BE"/>
+                              </w:rPr>
+                              <w:t xml:space="preserve">  </w:t>
+                            </w:r>
+                            <w:r>
+                              <w:rPr>
+                                <w:rFonts w:ascii="Arial" w:hAnsi="Arial" w:cs="Arial"/>
+                                <w:b/>
+                                <w:bCs/>
+                                <w:sz w:val="20"/>
+                                <w:szCs w:val="20"/>
+                                <w:lang w:val="nl-BE"/>
+                              </w:rPr>
+                              <w:t xml:space="preserve">                     </w:t>
+                            </w:r>
+                            <w:r>
+                              <w:rPr>
+                                <w:rFonts w:ascii="Arial" w:hAnsi="Arial" w:cs="Arial"/>
+                                <w:b/>
+                                <w:bCs/>
+                                <w:sz w:val="20"/>
+                                <w:szCs w:val="20"/>
+                                <w:lang w:val="nl-BE"/>
+                              </w:rPr>
+                              <w:t>Prof. Celine Vens</w:t>
                             </w:r>
                           </w:p>
                           <w:p>
@@ -1514,6 +1697,7 @@
                                 <w:bCs/>
                                 <w:sz w:val="20"/>
                                 <w:szCs w:val="20"/>
+                                <w:lang w:val="nl-BE"/>
                               </w:rPr>
                             </w:pPr>
                             <w:r>
@@ -1523,8 +1707,42 @@
                                 <w:bCs/>
                                 <w:sz w:val="20"/>
                                 <w:szCs w:val="20"/>
-                              </w:rPr>
-                              <w:t xml:space="preserve">  Prof. Thierry Van den Bosch</w:t>
+                                <w:lang w:val="nl-BE"/>
+                              </w:rPr>
+                              <w:t xml:space="preserve">  </w:t>
+                            </w:r>
+                            <w:r>
+                              <w:rPr>
+                                <w:rFonts w:ascii="Arial" w:hAnsi="Arial" w:cs="Arial"/>
+                                <w:b/>
+                                <w:bCs/>
+                                <w:sz w:val="20"/>
+                                <w:szCs w:val="20"/>
+                                <w:lang w:val="nl-BE"/>
+                              </w:rPr>
+                              <w:t xml:space="preserve"> </w:t>
+                            </w:r>
+                            <w:r>
+                              <w:rPr>
+                                <w:rFonts w:ascii="Arial" w:hAnsi="Arial" w:cs="Arial"/>
+                                <w:b/>
+                                <w:bCs/>
+                                <w:sz w:val="20"/>
+                                <w:szCs w:val="20"/>
+                                <w:lang w:val="nl-BE"/>
+                              </w:rPr>
+                              <w:t xml:space="preserve">                    </w:t>
+                            </w:r>
+                            <w:r>
+                              <w:rPr>
+                                <w:rFonts w:ascii="Arial" w:hAnsi="Arial" w:cs="Arial"/>
+                                <w:b/>
+                                <w:bCs/>
+                                <w:sz w:val="20"/>
+                                <w:szCs w:val="20"/>
+                                <w:lang w:val="nl-BE"/>
+                              </w:rPr>
+                              <w:t>Prof. Thierry Van den Bosch</w:t>
                             </w:r>
                           </w:p>
                         </w:txbxContent>
@@ -2062,10 +2280,6 @@
     </w:p>
   </w:footnote>
 </w:footnotes>
-</file>
-
-<file path=word/numbering.xml><?xml version="1.0" encoding="utf-8"?>
-<w:numbering xmlns:wpc="http://schemas.microsoft.com/office/word/2010/wordprocessingCanvas" xmlns:cx="http://schemas.microsoft.com/office/drawing/2014/chartex" xmlns:cx1="http://schemas.microsoft.com/office/drawing/2015/9/8/chartex" xmlns:cx2="http://schemas.microsoft.com/office/drawing/2015/10/21/chartex" xmlns:cx3="http://schemas.microsoft.com/office/drawing/2016/5/9/chartex" xmlns:cx4="http://schemas.microsoft.com/office/drawing/2016/5/10/chartex" xmlns:cx5="http://schemas.microsoft.com/office/drawing/2016/5/11/chartex" xmlns:cx6="http://schemas.microsoft.com/office/drawing/2016/5/12/chartex" xmlns:cx7="http://schemas.microsoft.com/office/drawing/2016/5/13/chartex" xmlns:cx8="http://schemas.microsoft.com/office/drawing/2016/5/14/chartex" xmlns:mc="http://schemas.openxmlformats.org/markup-compatibility/2006" xmlns:aink="http://schemas.microsoft.com/office/drawing/2016/ink" xmlns:am3d="http://schemas.microsoft.com/office/drawing/2017/model3d" xmlns:o="urn:schemas-microsoft-com:office:office" xmlns:oel="http://schemas.microsoft.com/office/2019/extlst" xmlns:r="http://schemas.openxmlformats.org/officeDocument/2006/relationships" xmlns:m="http://schemas.openxmlformats.org/officeDocument/2006/math" xmlns:v="urn:schemas-microsoft-com:vml" xmlns:wp14="http://schemas.microsoft.com/office/word/2010/wordprocessingDrawing" xmlns:wp="http://schemas.openxmlformats.org/drawingml/2006/wordprocessingDrawing" xmlns:w10="urn:schemas-microsoft-com:office:word" xmlns:w="http://schemas.openxmlformats.org/wordprocessingml/2006/main" xmlns:w14="http://schemas.microsoft.com/office/word/2010/wordml" xmlns:w15="http://schemas.microsoft.com/office/word/2012/wordml" xmlns:w16cex="http://schemas.microsoft.com/office/word/2018/wordml/cex" xmlns:w16cid="http://schemas.microsoft.com/office/word/2016/wordml/cid" xmlns:w16="http://schemas.microsoft.com/office/word/2018/wordml" xmlns:w16du="http://schemas.microsoft.com/office/word/2023/wordml/word16du" xmlns:w16sdtdh="http://schemas.microsoft.com/office/word/2020/wordml/sdtdatahash" xmlns:w16sdtfl="http://schemas.microsoft.com/office/word/2024/wordml/sdtformatlock" xmlns:w16se="http://schemas.microsoft.com/office/word/2015/wordml/symex" xmlns:wpg="http://schemas.microsoft.com/office/word/2010/wordprocessingGroup" xmlns:wpi="http://schemas.microsoft.com/office/word/2010/wordprocessingInk" xmlns:wne="http://schemas.microsoft.com/office/word/2006/wordml" xmlns:wps="http://schemas.microsoft.com/office/word/2010/wordprocessingShape" mc:Ignorable="w14 w15 w16se w16cid w16 w16cex w16sdtdh w16sdtfl w16du wp14"/>
 </file>
 
 <file path=word/styles.xml><?xml version="1.0" encoding="utf-8"?>

</xml_diff>

<commit_message>
Version printed and sent to supervisors
</commit_message>
<xml_diff>
--- a/title_page/title_page.docx
+++ b/title_page/title_page.docx
@@ -38,149 +38,12 @@
               <w:rPr>
                 <w:rFonts w:ascii="Arial" w:hAnsi="Arial" w:cs="Arial"/>
                 <w:noProof/>
-                <w:lang w:val="nl-BE" w:eastAsia="nl-BE"/>
-              </w:rPr>
-              <mc:AlternateContent>
-                <mc:Choice Requires="wps">
-                  <w:drawing>
-                    <wp:anchor distT="0" distB="0" distL="114300" distR="114300" simplePos="0" relativeHeight="251658243" behindDoc="0" locked="0" layoutInCell="1" allowOverlap="1" wp14:anchorId="3B147EA0" wp14:editId="3FEA9DC5">
-                      <wp:simplePos x="0" y="0"/>
-                      <wp:positionH relativeFrom="column">
-                        <wp:posOffset>2534285</wp:posOffset>
-                      </wp:positionH>
-                      <wp:positionV relativeFrom="paragraph">
-                        <wp:posOffset>9191625</wp:posOffset>
-                      </wp:positionV>
-                      <wp:extent cx="1371600" cy="274320"/>
-                      <wp:effectExtent l="0" t="0" r="0" b="0"/>
-                      <wp:wrapNone/>
-                      <wp:docPr id="2" name="Text Box 78"/>
-                      <wp:cNvGraphicFramePr>
-                        <a:graphicFrameLocks xmlns:a="http://schemas.openxmlformats.org/drawingml/2006/main"/>
-                      </wp:cNvGraphicFramePr>
-                      <a:graphic xmlns:a="http://schemas.openxmlformats.org/drawingml/2006/main">
-                        <a:graphicData uri="http://schemas.microsoft.com/office/word/2010/wordprocessingShape">
-                          <wps:wsp>
-                            <wps:cNvSpPr txBox="1">
-                              <a:spLocks noChangeArrowheads="1"/>
-                            </wps:cNvSpPr>
-                            <wps:spPr bwMode="auto">
-                              <a:xfrm>
-                                <a:off x="0" y="0"/>
-                                <a:ext cx="1371600" cy="274320"/>
-                              </a:xfrm>
-                              <a:prstGeom prst="rect">
-                                <a:avLst/>
-                              </a:prstGeom>
-                              <a:noFill/>
-                              <a:ln>
-                                <a:noFill/>
-                              </a:ln>
-                              <a:extLst>
-                                <a:ext uri="{909E8E84-426E-40DD-AFC4-6F175D3DCCD1}">
-                                  <a14:hiddenFill xmlns:a14="http://schemas.microsoft.com/office/drawing/2010/main">
-                                    <a:solidFill>
-                                      <a:srgbClr val="FFFFFF"/>
-                                    </a:solidFill>
-                                  </a14:hiddenFill>
-                                </a:ext>
-                                <a:ext uri="{91240B29-F687-4F45-9708-019B960494DF}">
-                                  <a14:hiddenLine xmlns:a14="http://schemas.microsoft.com/office/drawing/2010/main" w="9525">
-                                    <a:solidFill>
-                                      <a:srgbClr val="000000"/>
-                                    </a:solidFill>
-                                    <a:miter lim="800000"/>
-                                    <a:headEnd/>
-                                    <a:tailEnd/>
-                                  </a14:hiddenLine>
-                                </a:ext>
-                              </a:extLst>
-                            </wps:spPr>
-                            <wps:txbx>
-                              <w:txbxContent>
-                                <w:p>
-                                  <w:pPr>
-                                    <w:jc w:val="center"/>
-                                    <w:rPr>
-                                      <w:rFonts w:ascii="Arial" w:hAnsi="Arial" w:cs="Arial"/>
-                                      <w:sz w:val="20"/>
-                                      <w:szCs w:val="20"/>
-                                      <w:lang w:val="nl-BE"/>
-                                    </w:rPr>
-                                  </w:pPr>
-                                  <w:r>
-                                    <w:rPr>
-                                      <w:rFonts w:ascii="Arial" w:hAnsi="Arial" w:cs="Arial"/>
-                                      <w:sz w:val="20"/>
-                                      <w:szCs w:val="20"/>
-                                      <w:lang w:val="nl-BE"/>
-                                    </w:rPr>
-                                    <w:t>August 2026</w:t>
-                                  </w:r>
-                                </w:p>
-                              </w:txbxContent>
-                            </wps:txbx>
-                            <wps:bodyPr rot="0" vert="horz" wrap="square" lIns="91440" tIns="45720" rIns="91440" bIns="45720" anchor="t" anchorCtr="0" upright="1">
-                              <a:noAutofit/>
-                            </wps:bodyPr>
-                          </wps:wsp>
-                        </a:graphicData>
-                      </a:graphic>
-                      <wp14:sizeRelH relativeFrom="page">
-                        <wp14:pctWidth>0</wp14:pctWidth>
-                      </wp14:sizeRelH>
-                      <wp14:sizeRelV relativeFrom="page">
-                        <wp14:pctHeight>0</wp14:pctHeight>
-                      </wp14:sizeRelV>
-                    </wp:anchor>
-                  </w:drawing>
-                </mc:Choice>
-                <mc:Fallback>
-                  <w:pict>
-                    <v:shapetype w14:anchorId="3B147EA0" id="_x0000_t202" coordsize="21600,21600" o:spt="202" path="m,l,21600r21600,l21600,xe">
-                      <v:stroke joinstyle="miter"/>
-                      <v:path gradientshapeok="t" o:connecttype="rect"/>
-                    </v:shapetype>
-                    <v:shape id="Text Box 78" o:spid="_x0000_s1026" type="#_x0000_t202" style="position:absolute;margin-left:199.55pt;margin-top:723.75pt;width:108pt;height:21.6pt;z-index:251658243;visibility:visible;mso-wrap-style:square;mso-width-percent:0;mso-height-percent:0;mso-wrap-distance-left:9pt;mso-wrap-distance-top:0;mso-wrap-distance-right:9pt;mso-wrap-distance-bottom:0;mso-position-horizontal:absolute;mso-position-horizontal-relative:text;mso-position-vertical:absolute;mso-position-vertical-relative:text;mso-width-percent:0;mso-height-percent:0;mso-width-relative:page;mso-height-relative:page;v-text-anchor:top" o:gfxdata="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" filled="f" stroked="f">
-                      <v:textbox>
-                        <w:txbxContent>
-                          <w:p>
-                            <w:pPr>
-                              <w:jc w:val="center"/>
-                              <w:rPr>
-                                <w:rFonts w:ascii="Arial" w:hAnsi="Arial" w:cs="Arial"/>
-                                <w:sz w:val="20"/>
-                                <w:szCs w:val="20"/>
-                                <w:lang w:val="nl-BE"/>
-                              </w:rPr>
-                            </w:pPr>
-                            <w:r>
-                              <w:rPr>
-                                <w:rFonts w:ascii="Arial" w:hAnsi="Arial" w:cs="Arial"/>
-                                <w:sz w:val="20"/>
-                                <w:szCs w:val="20"/>
-                                <w:lang w:val="nl-BE"/>
-                              </w:rPr>
-                              <w:t>August 2026</w:t>
-                            </w:r>
-                          </w:p>
-                        </w:txbxContent>
-                      </v:textbox>
-                    </v:shape>
-                  </w:pict>
-                </mc:Fallback>
-              </mc:AlternateContent>
-            </w:r>
-            <w:r>
-              <w:rPr>
-                <w:rFonts w:ascii="Arial" w:hAnsi="Arial" w:cs="Arial"/>
-                <w:noProof/>
                 <w:lang w:val="en-GB"/>
               </w:rPr>
               <mc:AlternateContent>
                 <mc:Choice Requires="wps">
                   <w:drawing>
-                    <wp:anchor distT="0" distB="0" distL="114300" distR="114300" simplePos="0" relativeHeight="251658245" behindDoc="0" locked="0" layoutInCell="1" allowOverlap="1" wp14:anchorId="486A64BD" wp14:editId="34A78C6A">
+                    <wp:anchor distT="0" distB="0" distL="114300" distR="114300" simplePos="0" relativeHeight="251658245" behindDoc="0" locked="0" layoutInCell="1" allowOverlap="1" wp14:anchorId="486A64BD" wp14:editId="10D2EB6B">
                       <wp:simplePos x="0" y="0"/>
                       <wp:positionH relativeFrom="column">
                         <wp:posOffset>3435184</wp:posOffset>
@@ -284,7 +147,11 @@
                 </mc:Choice>
                 <mc:Fallback>
                   <w:pict>
-                    <v:shape w14:anchorId="486A64BD" id="Text Box 15" o:spid="_x0000_s1027" type="#_x0000_t202" style="position:absolute;margin-left:270.5pt;margin-top:7.7pt;width:170.05pt;height:90pt;z-index:251658245;visibility:visible;mso-wrap-style:square;mso-width-percent:0;mso-height-percent:0;mso-wrap-distance-left:9pt;mso-wrap-distance-top:0;mso-wrap-distance-right:9pt;mso-wrap-distance-bottom:0;mso-position-horizontal:absolute;mso-position-horizontal-relative:text;mso-position-vertical:absolute;mso-position-vertical-relative:text;mso-width-percent:0;mso-height-percent:0;mso-width-relative:margin;mso-height-relative:margin;v-text-anchor:top" o:gfxdata="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" fillcolor="white [3201]" stroked="f" strokeweight=".5pt">
+                    <v:shapetype w14:anchorId="486A64BD" id="_x0000_t202" coordsize="21600,21600" o:spt="202" path="m,l,21600r21600,l21600,xe">
+                      <v:stroke joinstyle="miter"/>
+                      <v:path gradientshapeok="t" o:connecttype="rect"/>
+                    </v:shapetype>
+                    <v:shape id="Text Box 15" o:spid="_x0000_s1026" type="#_x0000_t202" style="position:absolute;margin-left:270.5pt;margin-top:7.7pt;width:170.05pt;height:90pt;z-index:251658245;visibility:visible;mso-wrap-style:square;mso-width-percent:0;mso-height-percent:0;mso-wrap-distance-left:9pt;mso-wrap-distance-top:0;mso-wrap-distance-right:9pt;mso-wrap-distance-bottom:0;mso-position-horizontal:absolute;mso-position-horizontal-relative:text;mso-position-vertical:absolute;mso-position-vertical-relative:text;mso-width-percent:0;mso-height-percent:0;mso-width-relative:margin;mso-height-relative:margin;v-text-anchor:top" o:gfxdata="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" fillcolor="white [3201]" stroked="f" strokeweight=".5pt">
                       <v:textbox>
                         <w:txbxContent>
                           <w:p>
@@ -472,6 +339,820 @@
               <mc:AlternateContent>
                 <mc:Choice Requires="wps">
                   <w:drawing>
+                    <wp:anchor distT="0" distB="0" distL="114300" distR="114300" simplePos="0" relativeHeight="251658243" behindDoc="0" locked="0" layoutInCell="1" allowOverlap="1" wp14:anchorId="3B147EA0" wp14:editId="3A854C81">
+                      <wp:simplePos x="0" y="0"/>
+                      <wp:positionH relativeFrom="column">
+                        <wp:posOffset>-949325</wp:posOffset>
+                      </wp:positionH>
+                      <wp:positionV relativeFrom="paragraph">
+                        <wp:posOffset>7092315</wp:posOffset>
+                      </wp:positionV>
+                      <wp:extent cx="7543800" cy="274320"/>
+                      <wp:effectExtent l="0" t="0" r="0" b="0"/>
+                      <wp:wrapNone/>
+                      <wp:docPr id="2" name="Text Box 78"/>
+                      <wp:cNvGraphicFramePr>
+                        <a:graphicFrameLocks xmlns:a="http://schemas.openxmlformats.org/drawingml/2006/main"/>
+                      </wp:cNvGraphicFramePr>
+                      <a:graphic xmlns:a="http://schemas.openxmlformats.org/drawingml/2006/main">
+                        <a:graphicData uri="http://schemas.microsoft.com/office/word/2010/wordprocessingShape">
+                          <wps:wsp>
+                            <wps:cNvSpPr txBox="1">
+                              <a:spLocks noChangeArrowheads="1"/>
+                            </wps:cNvSpPr>
+                            <wps:spPr bwMode="auto">
+                              <a:xfrm>
+                                <a:off x="0" y="0"/>
+                                <a:ext cx="7543800" cy="274320"/>
+                              </a:xfrm>
+                              <a:prstGeom prst="rect">
+                                <a:avLst/>
+                              </a:prstGeom>
+                              <a:noFill/>
+                              <a:ln>
+                                <a:noFill/>
+                              </a:ln>
+                              <a:extLst>
+                                <a:ext uri="{909E8E84-426E-40DD-AFC4-6F175D3DCCD1}">
+                                  <a14:hiddenFill xmlns:a14="http://schemas.microsoft.com/office/drawing/2010/main">
+                                    <a:solidFill>
+                                      <a:srgbClr val="FFFFFF"/>
+                                    </a:solidFill>
+                                  </a14:hiddenFill>
+                                </a:ext>
+                                <a:ext uri="{91240B29-F687-4F45-9708-019B960494DF}">
+                                  <a14:hiddenLine xmlns:a14="http://schemas.microsoft.com/office/drawing/2010/main" w="9525">
+                                    <a:solidFill>
+                                      <a:srgbClr val="000000"/>
+                                    </a:solidFill>
+                                    <a:miter lim="800000"/>
+                                    <a:headEnd/>
+                                    <a:tailEnd/>
+                                  </a14:hiddenLine>
+                                </a:ext>
+                              </a:extLst>
+                            </wps:spPr>
+                            <wps:txbx>
+                              <w:txbxContent>
+                                <w:p>
+                                  <w:pPr>
+                                    <w:jc w:val="center"/>
+                                    <w:rPr>
+                                      <w:rFonts w:ascii="Arial" w:hAnsi="Arial" w:cs="Arial"/>
+                                      <w:sz w:val="20"/>
+                                      <w:szCs w:val="20"/>
+                                      <w:lang w:val="nl-BE"/>
+                                    </w:rPr>
+                                  </w:pPr>
+                                  <w:r>
+                                    <w:rPr>
+                                      <w:rFonts w:ascii="Arial" w:hAnsi="Arial" w:cs="Arial"/>
+                                      <w:sz w:val="20"/>
+                                      <w:szCs w:val="20"/>
+                                      <w:lang w:val="nl-BE"/>
+                                    </w:rPr>
+                                    <w:t>August 2026</w:t>
+                                  </w:r>
+                                </w:p>
+                              </w:txbxContent>
+                            </wps:txbx>
+                            <wps:bodyPr rot="0" vert="horz" wrap="square" lIns="91440" tIns="45720" rIns="91440" bIns="45720" anchor="t" anchorCtr="0" upright="1">
+                              <a:noAutofit/>
+                            </wps:bodyPr>
+                          </wps:wsp>
+                        </a:graphicData>
+                      </a:graphic>
+                      <wp14:sizeRelH relativeFrom="page">
+                        <wp14:pctWidth>0</wp14:pctWidth>
+                      </wp14:sizeRelH>
+                      <wp14:sizeRelV relativeFrom="page">
+                        <wp14:pctHeight>0</wp14:pctHeight>
+                      </wp14:sizeRelV>
+                    </wp:anchor>
+                  </w:drawing>
+                </mc:Choice>
+                <mc:Fallback>
+                  <w:pict>
+                    <v:shape w14:anchorId="3B147EA0" id="Text Box 78" o:spid="_x0000_s1027" type="#_x0000_t202" style="position:absolute;margin-left:-74.75pt;margin-top:558.45pt;width:594pt;height:21.6pt;z-index:251658243;visibility:visible;mso-wrap-style:square;mso-width-percent:0;mso-height-percent:0;mso-wrap-distance-left:9pt;mso-wrap-distance-top:0;mso-wrap-distance-right:9pt;mso-wrap-distance-bottom:0;mso-position-horizontal:absolute;mso-position-horizontal-relative:text;mso-position-vertical:absolute;mso-position-vertical-relative:text;mso-width-percent:0;mso-height-percent:0;mso-width-relative:page;mso-height-relative:page;v-text-anchor:top" o:gfxdata="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" filled="f" stroked="f">
+                      <v:textbox>
+                        <w:txbxContent>
+                          <w:p>
+                            <w:pPr>
+                              <w:jc w:val="center"/>
+                              <w:rPr>
+                                <w:rFonts w:ascii="Arial" w:hAnsi="Arial" w:cs="Arial"/>
+                                <w:sz w:val="20"/>
+                                <w:szCs w:val="20"/>
+                                <w:lang w:val="nl-BE"/>
+                              </w:rPr>
+                            </w:pPr>
+                            <w:r>
+                              <w:rPr>
+                                <w:rFonts w:ascii="Arial" w:hAnsi="Arial" w:cs="Arial"/>
+                                <w:sz w:val="20"/>
+                                <w:szCs w:val="20"/>
+                                <w:lang w:val="nl-BE"/>
+                              </w:rPr>
+                              <w:t>August 2026</w:t>
+                            </w:r>
+                          </w:p>
+                        </w:txbxContent>
+                      </v:textbox>
+                    </v:shape>
+                  </w:pict>
+                </mc:Fallback>
+              </mc:AlternateContent>
+            </w:r>
+            <w:r>
+              <w:rPr>
+                <w:rFonts w:ascii="Arial" w:hAnsi="Arial" w:cs="Arial"/>
+                <w:noProof/>
+                <w:lang w:val="nl-BE" w:eastAsia="nl-BE"/>
+              </w:rPr>
+              <mc:AlternateContent>
+                <mc:Choice Requires="wps">
+                  <w:drawing>
+                    <wp:anchor distT="0" distB="0" distL="114300" distR="114300" simplePos="0" relativeHeight="251659269" behindDoc="0" locked="0" layoutInCell="1" allowOverlap="1" wp14:anchorId="0184D457" wp14:editId="01FFE672">
+                      <wp:simplePos x="0" y="0"/>
+                      <wp:positionH relativeFrom="column">
+                        <wp:posOffset>1917700</wp:posOffset>
+                      </wp:positionH>
+                      <wp:positionV relativeFrom="paragraph">
+                        <wp:posOffset>5501640</wp:posOffset>
+                      </wp:positionV>
+                      <wp:extent cx="3333750" cy="1447800"/>
+                      <wp:effectExtent l="0" t="0" r="0" b="0"/>
+                      <wp:wrapNone/>
+                      <wp:docPr id="468411055" name="Text Box 7"/>
+                      <wp:cNvGraphicFramePr/>
+                      <a:graphic xmlns:a="http://schemas.openxmlformats.org/drawingml/2006/main">
+                        <a:graphicData uri="http://schemas.microsoft.com/office/word/2010/wordprocessingShape">
+                          <wps:wsp>
+                            <wps:cNvSpPr txBox="1"/>
+                            <wps:spPr>
+                              <a:xfrm>
+                                <a:off x="0" y="0"/>
+                                <a:ext cx="3333750" cy="1447800"/>
+                              </a:xfrm>
+                              <a:prstGeom prst="rect">
+                                <a:avLst/>
+                              </a:prstGeom>
+                              <a:noFill/>
+                              <a:ln w="6350">
+                                <a:noFill/>
+                              </a:ln>
+                            </wps:spPr>
+                            <wps:txbx>
+                              <w:txbxContent>
+                                <w:p>
+                                  <w:pPr>
+                                    <w:rPr>
+                                      <w:rFonts w:ascii="Arial" w:hAnsi="Arial" w:cs="Arial"/>
+                                      <w:sz w:val="20"/>
+                                      <w:szCs w:val="20"/>
+                                    </w:rPr>
+                                  </w:pPr>
+                                  <w:r>
+                                    <w:rPr>
+                                      <w:rFonts w:ascii="Arial" w:hAnsi="Arial" w:cs="Arial"/>
+                                      <w:b/>
+                                      <w:bCs/>
+                                      <w:sz w:val="20"/>
+                                      <w:szCs w:val="20"/>
+                                    </w:rPr>
+                                    <w:t>Prof.</w:t>
+                                  </w:r>
+                                  <w:r>
+                                    <w:rPr>
+                                      <w:rFonts w:ascii="Arial" w:hAnsi="Arial" w:cs="Arial"/>
+                                      <w:sz w:val="20"/>
+                                      <w:szCs w:val="20"/>
+                                    </w:rPr>
+                                    <w:t xml:space="preserve"> </w:t>
+                                  </w:r>
+                                  <w:r>
+                                    <w:rPr>
+                                      <w:rFonts w:ascii="Arial" w:hAnsi="Arial" w:cs="Arial"/>
+                                      <w:b/>
+                                      <w:bCs/>
+                                      <w:sz w:val="20"/>
+                                      <w:szCs w:val="20"/>
+                                    </w:rPr>
+                                    <w:t>Ben Van Calster</w:t>
+                                  </w:r>
+                                </w:p>
+                                <w:p>
+                                  <w:pPr>
+                                    <w:rPr>
+                                      <w:rFonts w:ascii="Arial" w:hAnsi="Arial" w:cs="Arial"/>
+                                      <w:b/>
+                                      <w:bCs/>
+                                      <w:sz w:val="20"/>
+                                      <w:szCs w:val="20"/>
+                                    </w:rPr>
+                                  </w:pPr>
+                                  <w:r>
+                                    <w:rPr>
+                                      <w:rFonts w:ascii="Arial" w:hAnsi="Arial" w:cs="Arial"/>
+                                      <w:b/>
+                                      <w:bCs/>
+                                      <w:sz w:val="20"/>
+                                      <w:szCs w:val="20"/>
+                                    </w:rPr>
+                                    <w:t>Prof.</w:t>
+                                  </w:r>
+                                  <w:r>
+                                    <w:rPr>
+                                      <w:rFonts w:ascii="Arial" w:hAnsi="Arial" w:cs="Arial"/>
+                                      <w:sz w:val="20"/>
+                                      <w:szCs w:val="20"/>
+                                    </w:rPr>
+                                    <w:t xml:space="preserve"> </w:t>
+                                  </w:r>
+                                  <w:r>
+                                    <w:rPr>
+                                      <w:rFonts w:ascii="Arial" w:hAnsi="Arial" w:cs="Arial"/>
+                                      <w:b/>
+                                      <w:bCs/>
+                                      <w:sz w:val="20"/>
+                                      <w:szCs w:val="20"/>
+                                    </w:rPr>
+                                    <w:t>Laure Wynants</w:t>
+                                  </w:r>
+                                </w:p>
+                                <w:p>
+                                  <w:pPr>
+                                    <w:rPr>
+                                      <w:rFonts w:ascii="Arial" w:hAnsi="Arial" w:cs="Arial"/>
+                                      <w:sz w:val="20"/>
+                                      <w:szCs w:val="20"/>
+                                    </w:rPr>
+                                  </w:pPr>
+                                  <w:r>
+                                    <w:rPr>
+                                      <w:rFonts w:ascii="Arial" w:hAnsi="Arial" w:cs="Arial"/>
+                                      <w:b/>
+                                      <w:bCs/>
+                                      <w:sz w:val="20"/>
+                                      <w:szCs w:val="20"/>
+                                    </w:rPr>
+                                    <w:t>Prof.</w:t>
+                                  </w:r>
+                                  <w:r>
+                                    <w:rPr>
+                                      <w:rFonts w:ascii="Arial" w:hAnsi="Arial" w:cs="Arial"/>
+                                      <w:sz w:val="20"/>
+                                      <w:szCs w:val="20"/>
+                                    </w:rPr>
+                                    <w:t xml:space="preserve"> </w:t>
+                                  </w:r>
+                                  <w:r>
+                                    <w:rPr>
+                                      <w:rFonts w:ascii="Arial" w:hAnsi="Arial" w:cs="Arial"/>
+                                      <w:b/>
+                                      <w:bCs/>
+                                      <w:sz w:val="20"/>
+                                      <w:szCs w:val="20"/>
+                                    </w:rPr>
+                                    <w:t>Dirk Timmerman</w:t>
+                                  </w:r>
+                                </w:p>
+                                <w:p>
+                                  <w:pPr>
+                                    <w:rPr>
+                                      <w:rFonts w:ascii="Arial" w:hAnsi="Arial" w:cs="Arial"/>
+                                      <w:sz w:val="20"/>
+                                      <w:szCs w:val="20"/>
+                                    </w:rPr>
+                                  </w:pPr>
+                                  <w:r>
+                                    <w:rPr>
+                                      <w:rFonts w:ascii="Arial" w:hAnsi="Arial" w:cs="Arial"/>
+                                      <w:b/>
+                                      <w:bCs/>
+                                      <w:sz w:val="20"/>
+                                      <w:szCs w:val="20"/>
+                                    </w:rPr>
+                                    <w:t>Prof.</w:t>
+                                  </w:r>
+                                  <w:r>
+                                    <w:rPr>
+                                      <w:rFonts w:ascii="Arial" w:hAnsi="Arial" w:cs="Arial"/>
+                                      <w:sz w:val="20"/>
+                                      <w:szCs w:val="20"/>
+                                    </w:rPr>
+                                    <w:t xml:space="preserve"> </w:t>
+                                  </w:r>
+                                  <w:r>
+                                    <w:rPr>
+                                      <w:rFonts w:ascii="Arial" w:hAnsi="Arial" w:cs="Arial"/>
+                                      <w:b/>
+                                      <w:bCs/>
+                                      <w:sz w:val="20"/>
+                                      <w:szCs w:val="20"/>
+                                    </w:rPr>
+                                    <w:t xml:space="preserve">An </w:t>
+                                  </w:r>
+                                  <w:proofErr w:type="spellStart"/>
+                                  <w:r>
+                                    <w:rPr>
+                                      <w:rFonts w:ascii="Arial" w:hAnsi="Arial" w:cs="Arial"/>
+                                      <w:b/>
+                                      <w:bCs/>
+                                      <w:sz w:val="20"/>
+                                      <w:szCs w:val="20"/>
+                                    </w:rPr>
+                                    <w:t>Coosemans</w:t>
+                                  </w:r>
+                                  <w:proofErr w:type="spellEnd"/>
+                                </w:p>
+                                <w:p>
+                                  <w:pPr>
+                                    <w:rPr>
+                                      <w:rFonts w:ascii="Arial" w:hAnsi="Arial" w:cs="Arial"/>
+                                      <w:sz w:val="20"/>
+                                      <w:szCs w:val="20"/>
+                                    </w:rPr>
+                                  </w:pPr>
+                                  <w:r>
+                                    <w:rPr>
+                                      <w:rFonts w:ascii="Arial" w:hAnsi="Arial" w:cs="Arial"/>
+                                      <w:b/>
+                                      <w:bCs/>
+                                      <w:sz w:val="20"/>
+                                      <w:szCs w:val="20"/>
+                                    </w:rPr>
+                                    <w:t>Prof.</w:t>
+                                  </w:r>
+                                  <w:r>
+                                    <w:rPr>
+                                      <w:rFonts w:ascii="Arial" w:hAnsi="Arial" w:cs="Arial"/>
+                                      <w:sz w:val="20"/>
+                                      <w:szCs w:val="20"/>
+                                    </w:rPr>
+                                    <w:t xml:space="preserve"> </w:t>
+                                  </w:r>
+                                  <w:r>
+                                    <w:rPr>
+                                      <w:rFonts w:ascii="Arial" w:hAnsi="Arial" w:cs="Arial"/>
+                                      <w:b/>
+                                      <w:bCs/>
+                                      <w:sz w:val="20"/>
+                                      <w:szCs w:val="20"/>
+                                    </w:rPr>
+                                    <w:t>Rik Lories</w:t>
+                                  </w:r>
+                                </w:p>
+                                <w:p>
+                                  <w:pPr>
+                                    <w:rPr>
+                                      <w:rFonts w:ascii="Arial" w:hAnsi="Arial" w:cs="Arial"/>
+                                      <w:b/>
+                                      <w:bCs/>
+                                      <w:sz w:val="20"/>
+                                      <w:szCs w:val="20"/>
+                                    </w:rPr>
+                                  </w:pPr>
+                                  <w:r>
+                                    <w:rPr>
+                                      <w:rFonts w:ascii="Arial" w:hAnsi="Arial" w:cs="Arial"/>
+                                      <w:b/>
+                                      <w:bCs/>
+                                      <w:sz w:val="20"/>
+                                      <w:szCs w:val="20"/>
+                                    </w:rPr>
+                                    <w:t xml:space="preserve">Prof. </w:t>
+                                  </w:r>
+                                  <w:r>
+                                    <w:rPr>
+                                      <w:rFonts w:ascii="Arial" w:hAnsi="Arial" w:cs="Arial"/>
+                                      <w:b/>
+                                      <w:bCs/>
+                                      <w:sz w:val="20"/>
+                                      <w:szCs w:val="20"/>
+                                    </w:rPr>
+                                    <w:t>Thomas Debray</w:t>
+                                  </w:r>
+                                </w:p>
+                                <w:p>
+                                  <w:pPr>
+                                    <w:rPr>
+                                      <w:rFonts w:ascii="Arial" w:hAnsi="Arial" w:cs="Arial"/>
+                                      <w:b/>
+                                      <w:bCs/>
+                                      <w:sz w:val="20"/>
+                                      <w:szCs w:val="20"/>
+                                    </w:rPr>
+                                  </w:pPr>
+                                  <w:r>
+                                    <w:rPr>
+                                      <w:rFonts w:ascii="Arial" w:hAnsi="Arial" w:cs="Arial"/>
+                                      <w:b/>
+                                      <w:bCs/>
+                                      <w:sz w:val="20"/>
+                                      <w:szCs w:val="20"/>
+                                    </w:rPr>
+                                    <w:t>Prof. Peggy Geomini</w:t>
+                                  </w:r>
+                                </w:p>
+                                <w:p>
+                                  <w:pPr>
+                                    <w:rPr>
+                                      <w:rFonts w:ascii="Arial" w:hAnsi="Arial" w:cs="Arial"/>
+                                      <w:b/>
+                                      <w:bCs/>
+                                      <w:sz w:val="20"/>
+                                      <w:szCs w:val="20"/>
+                                      <w:lang w:val="nl-BE"/>
+                                    </w:rPr>
+                                  </w:pPr>
+                                  <w:r>
+                                    <w:rPr>
+                                      <w:rFonts w:ascii="Arial" w:hAnsi="Arial" w:cs="Arial"/>
+                                      <w:b/>
+                                      <w:bCs/>
+                                      <w:sz w:val="20"/>
+                                      <w:szCs w:val="20"/>
+                                      <w:lang w:val="nl-BE"/>
+                                    </w:rPr>
+                                    <w:t>Prof. Celine Vens</w:t>
+                                  </w:r>
+                                </w:p>
+                                <w:p>
+                                  <w:pPr>
+                                    <w:rPr>
+                                      <w:rFonts w:ascii="Arial" w:hAnsi="Arial" w:cs="Arial"/>
+                                      <w:b/>
+                                      <w:bCs/>
+                                      <w:sz w:val="20"/>
+                                      <w:szCs w:val="20"/>
+                                      <w:lang w:val="nl-BE"/>
+                                    </w:rPr>
+                                  </w:pPr>
+                                  <w:r>
+                                    <w:rPr>
+                                      <w:rFonts w:ascii="Arial" w:hAnsi="Arial" w:cs="Arial"/>
+                                      <w:b/>
+                                      <w:bCs/>
+                                      <w:sz w:val="20"/>
+                                      <w:szCs w:val="20"/>
+                                      <w:lang w:val="nl-BE"/>
+                                    </w:rPr>
+                                    <w:t>Prof. Thierry Van den Bosch</w:t>
+                                  </w:r>
+                                </w:p>
+                                <w:p>
+                                  <w:pPr>
+                                    <w:rPr>
+                                      <w:lang w:val="nl-BE"/>
+                                    </w:rPr>
+                                  </w:pPr>
+                                </w:p>
+                              </w:txbxContent>
+                            </wps:txbx>
+                            <wps:bodyPr rot="0" spcFirstLastPara="0" vertOverflow="overflow" horzOverflow="overflow" vert="horz" wrap="square" lIns="91440" tIns="45720" rIns="91440" bIns="45720" numCol="1" spcCol="0" rtlCol="0" fromWordArt="0" anchor="t" anchorCtr="0" forceAA="0" compatLnSpc="1">
+                              <a:prstTxWarp prst="textNoShape">
+                                <a:avLst/>
+                              </a:prstTxWarp>
+                              <a:noAutofit/>
+                            </wps:bodyPr>
+                          </wps:wsp>
+                        </a:graphicData>
+                      </a:graphic>
+                      <wp14:sizeRelH relativeFrom="margin">
+                        <wp14:pctWidth>0</wp14:pctWidth>
+                      </wp14:sizeRelH>
+                      <wp14:sizeRelV relativeFrom="margin">
+                        <wp14:pctHeight>0</wp14:pctHeight>
+                      </wp14:sizeRelV>
+                    </wp:anchor>
+                  </w:drawing>
+                </mc:Choice>
+                <mc:Fallback>
+                  <w:pict>
+                    <v:shape w14:anchorId="0184D457" id="Text Box 7" o:spid="_x0000_s1028" type="#_x0000_t202" style="position:absolute;margin-left:151pt;margin-top:433.2pt;width:262.5pt;height:114pt;z-index:251659269;visibility:visible;mso-wrap-style:square;mso-width-percent:0;mso-height-percent:0;mso-wrap-distance-left:9pt;mso-wrap-distance-top:0;mso-wrap-distance-right:9pt;mso-wrap-distance-bottom:0;mso-position-horizontal:absolute;mso-position-horizontal-relative:text;mso-position-vertical:absolute;mso-position-vertical-relative:text;mso-width-percent:0;mso-height-percent:0;mso-width-relative:margin;mso-height-relative:margin;v-text-anchor:top" o:gfxdata="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" filled="f" stroked="f" strokeweight=".5pt">
+                      <v:textbox>
+                        <w:txbxContent>
+                          <w:p>
+                            <w:pPr>
+                              <w:rPr>
+                                <w:rFonts w:ascii="Arial" w:hAnsi="Arial" w:cs="Arial"/>
+                                <w:sz w:val="20"/>
+                                <w:szCs w:val="20"/>
+                              </w:rPr>
+                            </w:pPr>
+                            <w:r>
+                              <w:rPr>
+                                <w:rFonts w:ascii="Arial" w:hAnsi="Arial" w:cs="Arial"/>
+                                <w:b/>
+                                <w:bCs/>
+                                <w:sz w:val="20"/>
+                                <w:szCs w:val="20"/>
+                              </w:rPr>
+                              <w:t>Prof.</w:t>
+                            </w:r>
+                            <w:r>
+                              <w:rPr>
+                                <w:rFonts w:ascii="Arial" w:hAnsi="Arial" w:cs="Arial"/>
+                                <w:sz w:val="20"/>
+                                <w:szCs w:val="20"/>
+                              </w:rPr>
+                              <w:t xml:space="preserve"> </w:t>
+                            </w:r>
+                            <w:r>
+                              <w:rPr>
+                                <w:rFonts w:ascii="Arial" w:hAnsi="Arial" w:cs="Arial"/>
+                                <w:b/>
+                                <w:bCs/>
+                                <w:sz w:val="20"/>
+                                <w:szCs w:val="20"/>
+                              </w:rPr>
+                              <w:t>Ben Van Calster</w:t>
+                            </w:r>
+                          </w:p>
+                          <w:p>
+                            <w:pPr>
+                              <w:rPr>
+                                <w:rFonts w:ascii="Arial" w:hAnsi="Arial" w:cs="Arial"/>
+                                <w:b/>
+                                <w:bCs/>
+                                <w:sz w:val="20"/>
+                                <w:szCs w:val="20"/>
+                              </w:rPr>
+                            </w:pPr>
+                            <w:r>
+                              <w:rPr>
+                                <w:rFonts w:ascii="Arial" w:hAnsi="Arial" w:cs="Arial"/>
+                                <w:b/>
+                                <w:bCs/>
+                                <w:sz w:val="20"/>
+                                <w:szCs w:val="20"/>
+                              </w:rPr>
+                              <w:t>Prof.</w:t>
+                            </w:r>
+                            <w:r>
+                              <w:rPr>
+                                <w:rFonts w:ascii="Arial" w:hAnsi="Arial" w:cs="Arial"/>
+                                <w:sz w:val="20"/>
+                                <w:szCs w:val="20"/>
+                              </w:rPr>
+                              <w:t xml:space="preserve"> </w:t>
+                            </w:r>
+                            <w:r>
+                              <w:rPr>
+                                <w:rFonts w:ascii="Arial" w:hAnsi="Arial" w:cs="Arial"/>
+                                <w:b/>
+                                <w:bCs/>
+                                <w:sz w:val="20"/>
+                                <w:szCs w:val="20"/>
+                              </w:rPr>
+                              <w:t>Laure Wynants</w:t>
+                            </w:r>
+                          </w:p>
+                          <w:p>
+                            <w:pPr>
+                              <w:rPr>
+                                <w:rFonts w:ascii="Arial" w:hAnsi="Arial" w:cs="Arial"/>
+                                <w:sz w:val="20"/>
+                                <w:szCs w:val="20"/>
+                              </w:rPr>
+                            </w:pPr>
+                            <w:r>
+                              <w:rPr>
+                                <w:rFonts w:ascii="Arial" w:hAnsi="Arial" w:cs="Arial"/>
+                                <w:b/>
+                                <w:bCs/>
+                                <w:sz w:val="20"/>
+                                <w:szCs w:val="20"/>
+                              </w:rPr>
+                              <w:t>Prof.</w:t>
+                            </w:r>
+                            <w:r>
+                              <w:rPr>
+                                <w:rFonts w:ascii="Arial" w:hAnsi="Arial" w:cs="Arial"/>
+                                <w:sz w:val="20"/>
+                                <w:szCs w:val="20"/>
+                              </w:rPr>
+                              <w:t xml:space="preserve"> </w:t>
+                            </w:r>
+                            <w:r>
+                              <w:rPr>
+                                <w:rFonts w:ascii="Arial" w:hAnsi="Arial" w:cs="Arial"/>
+                                <w:b/>
+                                <w:bCs/>
+                                <w:sz w:val="20"/>
+                                <w:szCs w:val="20"/>
+                              </w:rPr>
+                              <w:t>Dirk Timmerman</w:t>
+                            </w:r>
+                          </w:p>
+                          <w:p>
+                            <w:pPr>
+                              <w:rPr>
+                                <w:rFonts w:ascii="Arial" w:hAnsi="Arial" w:cs="Arial"/>
+                                <w:sz w:val="20"/>
+                                <w:szCs w:val="20"/>
+                              </w:rPr>
+                            </w:pPr>
+                            <w:r>
+                              <w:rPr>
+                                <w:rFonts w:ascii="Arial" w:hAnsi="Arial" w:cs="Arial"/>
+                                <w:b/>
+                                <w:bCs/>
+                                <w:sz w:val="20"/>
+                                <w:szCs w:val="20"/>
+                              </w:rPr>
+                              <w:t>Prof.</w:t>
+                            </w:r>
+                            <w:r>
+                              <w:rPr>
+                                <w:rFonts w:ascii="Arial" w:hAnsi="Arial" w:cs="Arial"/>
+                                <w:sz w:val="20"/>
+                                <w:szCs w:val="20"/>
+                              </w:rPr>
+                              <w:t xml:space="preserve"> </w:t>
+                            </w:r>
+                            <w:r>
+                              <w:rPr>
+                                <w:rFonts w:ascii="Arial" w:hAnsi="Arial" w:cs="Arial"/>
+                                <w:b/>
+                                <w:bCs/>
+                                <w:sz w:val="20"/>
+                                <w:szCs w:val="20"/>
+                              </w:rPr>
+                              <w:t xml:space="preserve">An </w:t>
+                            </w:r>
+                            <w:proofErr w:type="spellStart"/>
+                            <w:r>
+                              <w:rPr>
+                                <w:rFonts w:ascii="Arial" w:hAnsi="Arial" w:cs="Arial"/>
+                                <w:b/>
+                                <w:bCs/>
+                                <w:sz w:val="20"/>
+                                <w:szCs w:val="20"/>
+                              </w:rPr>
+                              <w:t>Coosemans</w:t>
+                            </w:r>
+                            <w:proofErr w:type="spellEnd"/>
+                          </w:p>
+                          <w:p>
+                            <w:pPr>
+                              <w:rPr>
+                                <w:rFonts w:ascii="Arial" w:hAnsi="Arial" w:cs="Arial"/>
+                                <w:sz w:val="20"/>
+                                <w:szCs w:val="20"/>
+                              </w:rPr>
+                            </w:pPr>
+                            <w:r>
+                              <w:rPr>
+                                <w:rFonts w:ascii="Arial" w:hAnsi="Arial" w:cs="Arial"/>
+                                <w:b/>
+                                <w:bCs/>
+                                <w:sz w:val="20"/>
+                                <w:szCs w:val="20"/>
+                              </w:rPr>
+                              <w:t>Prof.</w:t>
+                            </w:r>
+                            <w:r>
+                              <w:rPr>
+                                <w:rFonts w:ascii="Arial" w:hAnsi="Arial" w:cs="Arial"/>
+                                <w:sz w:val="20"/>
+                                <w:szCs w:val="20"/>
+                              </w:rPr>
+                              <w:t xml:space="preserve"> </w:t>
+                            </w:r>
+                            <w:r>
+                              <w:rPr>
+                                <w:rFonts w:ascii="Arial" w:hAnsi="Arial" w:cs="Arial"/>
+                                <w:b/>
+                                <w:bCs/>
+                                <w:sz w:val="20"/>
+                                <w:szCs w:val="20"/>
+                              </w:rPr>
+                              <w:t>Rik Lories</w:t>
+                            </w:r>
+                          </w:p>
+                          <w:p>
+                            <w:pPr>
+                              <w:rPr>
+                                <w:rFonts w:ascii="Arial" w:hAnsi="Arial" w:cs="Arial"/>
+                                <w:b/>
+                                <w:bCs/>
+                                <w:sz w:val="20"/>
+                                <w:szCs w:val="20"/>
+                              </w:rPr>
+                            </w:pPr>
+                            <w:r>
+                              <w:rPr>
+                                <w:rFonts w:ascii="Arial" w:hAnsi="Arial" w:cs="Arial"/>
+                                <w:b/>
+                                <w:bCs/>
+                                <w:sz w:val="20"/>
+                                <w:szCs w:val="20"/>
+                              </w:rPr>
+                              <w:t xml:space="preserve">Prof. </w:t>
+                            </w:r>
+                            <w:r>
+                              <w:rPr>
+                                <w:rFonts w:ascii="Arial" w:hAnsi="Arial" w:cs="Arial"/>
+                                <w:b/>
+                                <w:bCs/>
+                                <w:sz w:val="20"/>
+                                <w:szCs w:val="20"/>
+                              </w:rPr>
+                              <w:t>Thomas Debray</w:t>
+                            </w:r>
+                          </w:p>
+                          <w:p>
+                            <w:pPr>
+                              <w:rPr>
+                                <w:rFonts w:ascii="Arial" w:hAnsi="Arial" w:cs="Arial"/>
+                                <w:b/>
+                                <w:bCs/>
+                                <w:sz w:val="20"/>
+                                <w:szCs w:val="20"/>
+                              </w:rPr>
+                            </w:pPr>
+                            <w:r>
+                              <w:rPr>
+                                <w:rFonts w:ascii="Arial" w:hAnsi="Arial" w:cs="Arial"/>
+                                <w:b/>
+                                <w:bCs/>
+                                <w:sz w:val="20"/>
+                                <w:szCs w:val="20"/>
+                              </w:rPr>
+                              <w:t>Prof. Peggy Geomini</w:t>
+                            </w:r>
+                          </w:p>
+                          <w:p>
+                            <w:pPr>
+                              <w:rPr>
+                                <w:rFonts w:ascii="Arial" w:hAnsi="Arial" w:cs="Arial"/>
+                                <w:b/>
+                                <w:bCs/>
+                                <w:sz w:val="20"/>
+                                <w:szCs w:val="20"/>
+                                <w:lang w:val="nl-BE"/>
+                              </w:rPr>
+                            </w:pPr>
+                            <w:r>
+                              <w:rPr>
+                                <w:rFonts w:ascii="Arial" w:hAnsi="Arial" w:cs="Arial"/>
+                                <w:b/>
+                                <w:bCs/>
+                                <w:sz w:val="20"/>
+                                <w:szCs w:val="20"/>
+                                <w:lang w:val="nl-BE"/>
+                              </w:rPr>
+                              <w:t>Prof. Celine Vens</w:t>
+                            </w:r>
+                          </w:p>
+                          <w:p>
+                            <w:pPr>
+                              <w:rPr>
+                                <w:rFonts w:ascii="Arial" w:hAnsi="Arial" w:cs="Arial"/>
+                                <w:b/>
+                                <w:bCs/>
+                                <w:sz w:val="20"/>
+                                <w:szCs w:val="20"/>
+                                <w:lang w:val="nl-BE"/>
+                              </w:rPr>
+                            </w:pPr>
+                            <w:r>
+                              <w:rPr>
+                                <w:rFonts w:ascii="Arial" w:hAnsi="Arial" w:cs="Arial"/>
+                                <w:b/>
+                                <w:bCs/>
+                                <w:sz w:val="20"/>
+                                <w:szCs w:val="20"/>
+                                <w:lang w:val="nl-BE"/>
+                              </w:rPr>
+                              <w:t>Prof. Thierry Van den Bosch</w:t>
+                            </w:r>
+                          </w:p>
+                          <w:p>
+                            <w:pPr>
+                              <w:rPr>
+                                <w:lang w:val="nl-BE"/>
+                              </w:rPr>
+                            </w:pPr>
+                          </w:p>
+                        </w:txbxContent>
+                      </v:textbox>
+                    </v:shape>
+                  </w:pict>
+                </mc:Fallback>
+              </mc:AlternateContent>
+            </w:r>
+            <w:r>
+              <w:rPr>
+                <w:rFonts w:ascii="Arial" w:hAnsi="Arial" w:cs="Arial"/>
+                <w:noProof/>
+                <w:lang w:val="nl-BE" w:eastAsia="nl-BE"/>
+              </w:rPr>
+              <mc:AlternateContent>
+                <mc:Choice Requires="wps">
+                  <w:drawing>
                     <wp:anchor distT="0" distB="0" distL="114300" distR="114300" simplePos="0" relativeHeight="251658240" behindDoc="0" locked="0" layoutInCell="1" allowOverlap="1" wp14:anchorId="6D4F79A0" wp14:editId="09121F62">
                       <wp:simplePos x="0" y="0"/>
                       <wp:positionH relativeFrom="column">
@@ -583,7 +1264,7 @@
                 </mc:Choice>
                 <mc:Fallback>
                   <w:pict>
-                    <v:shape w14:anchorId="6D4F79A0" id="Text Box 75" o:spid="_x0000_s1028" type="#_x0000_t202" style="position:absolute;margin-left:26.95pt;margin-top:93.9pt;width:363pt;height:103.2pt;z-index:251658240;visibility:visible;mso-wrap-style:square;mso-width-percent:0;mso-height-percent:0;mso-wrap-distance-left:9pt;mso-wrap-distance-top:0;mso-wrap-distance-right:9pt;mso-wrap-distance-bottom:0;mso-position-horizontal:absolute;mso-position-horizontal-relative:text;mso-position-vertical:absolute;mso-position-vertical-relative:text;mso-width-percent:0;mso-height-percent:0;mso-width-relative:page;mso-height-relative:page;v-text-anchor:top" o:gfxdata="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" filled="f" stroked="f">
+                    <v:shape w14:anchorId="6D4F79A0" id="Text Box 75" o:spid="_x0000_s1029" type="#_x0000_t202" style="position:absolute;margin-left:26.95pt;margin-top:93.9pt;width:363pt;height:103.2pt;z-index:251658240;visibility:visible;mso-wrap-style:square;mso-width-percent:0;mso-height-percent:0;mso-wrap-distance-left:9pt;mso-wrap-distance-top:0;mso-wrap-distance-right:9pt;mso-wrap-distance-bottom:0;mso-position-horizontal:absolute;mso-position-horizontal-relative:text;mso-position-vertical:absolute;mso-position-vertical-relative:text;mso-width-percent:0;mso-height-percent:0;mso-width-relative:page;mso-height-relative:page;v-text-anchor:top" o:gfxdata="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" filled="f" stroked="f">
                       <v:textbox>
                         <w:txbxContent>
                           <w:p>
@@ -728,7 +1409,7 @@
                 </mc:Choice>
                 <mc:Fallback>
                   <w:pict>
-                    <v:shape w14:anchorId="2FBC8E57" id="Text Box 76" o:spid="_x0000_s1029" type="#_x0000_t202" style="position:absolute;margin-left:27pt;margin-top:198pt;width:153pt;height:30.6pt;z-index:251658241;visibility:visible;mso-wrap-style:square;mso-width-percent:0;mso-height-percent:0;mso-wrap-distance-left:9pt;mso-wrap-distance-top:0;mso-wrap-distance-right:9pt;mso-wrap-distance-bottom:0;mso-position-horizontal:absolute;mso-position-horizontal-relative:text;mso-position-vertical:absolute;mso-position-vertical-relative:text;mso-width-percent:0;mso-height-percent:0;mso-width-relative:page;mso-height-relative:page;v-text-anchor:top" o:gfxdata="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" filled="f" stroked="f">
+                    <v:shape w14:anchorId="2FBC8E57" id="Text Box 76" o:spid="_x0000_s1030" type="#_x0000_t202" style="position:absolute;margin-left:27pt;margin-top:198pt;width:153pt;height:30.6pt;z-index:251658241;visibility:visible;mso-wrap-style:square;mso-width-percent:0;mso-height-percent:0;mso-wrap-distance-left:9pt;mso-wrap-distance-top:0;mso-wrap-distance-right:9pt;mso-wrap-distance-bottom:0;mso-position-horizontal:absolute;mso-position-horizontal-relative:text;mso-position-vertical:absolute;mso-position-vertical-relative:text;mso-width-percent:0;mso-height-percent:0;mso-width-relative:page;mso-height-relative:page;v-text-anchor:top" o:gfxdata="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" filled="f" stroked="f">
                       <v:textbox>
                         <w:txbxContent>
                           <w:p>
@@ -762,7 +1443,7 @@
               <mc:AlternateContent>
                 <mc:Choice Requires="wps">
                   <w:drawing>
-                    <wp:anchor distT="0" distB="0" distL="114300" distR="114300" simplePos="0" relativeHeight="251658244" behindDoc="0" locked="0" layoutInCell="1" allowOverlap="1" wp14:anchorId="1AC28B9D" wp14:editId="39E73F78">
+                    <wp:anchor distT="0" distB="0" distL="114300" distR="114300" simplePos="0" relativeHeight="251658244" behindDoc="0" locked="0" layoutInCell="1" allowOverlap="1" wp14:anchorId="1AC28B9D" wp14:editId="09A4315F">
                       <wp:simplePos x="0" y="0"/>
                       <wp:positionH relativeFrom="column">
                         <wp:posOffset>327025</wp:posOffset>
@@ -876,50 +1557,6 @@
                                     </w:rPr>
                                     <w:t>r:</w:t>
                                   </w:r>
-                                  <w:r>
-                                    <w:rPr>
-                                      <w:rFonts w:ascii="Arial" w:hAnsi="Arial" w:cs="Arial"/>
-                                      <w:sz w:val="20"/>
-                                      <w:szCs w:val="20"/>
-                                    </w:rPr>
-                                    <w:t xml:space="preserve"> </w:t>
-                                  </w:r>
-                                  <w:r>
-                                    <w:rPr>
-                                      <w:rFonts w:ascii="Arial" w:hAnsi="Arial" w:cs="Arial"/>
-                                      <w:sz w:val="20"/>
-                                      <w:szCs w:val="20"/>
-                                    </w:rPr>
-                                    <w:t xml:space="preserve">                          </w:t>
-                                  </w:r>
-                                  <w:r>
-                                    <w:rPr>
-                                      <w:rFonts w:ascii="Arial" w:hAnsi="Arial" w:cs="Arial"/>
-                                      <w:b/>
-                                      <w:bCs/>
-                                      <w:sz w:val="20"/>
-                                      <w:szCs w:val="20"/>
-                                    </w:rPr>
-                                    <w:t>Prof.</w:t>
-                                  </w:r>
-                                  <w:r>
-                                    <w:rPr>
-                                      <w:rFonts w:ascii="Arial" w:hAnsi="Arial" w:cs="Arial"/>
-                                      <w:sz w:val="20"/>
-                                      <w:szCs w:val="20"/>
-                                    </w:rPr>
-                                    <w:t xml:space="preserve"> </w:t>
-                                  </w:r>
-                                  <w:r>
-                                    <w:rPr>
-                                      <w:rFonts w:ascii="Arial" w:hAnsi="Arial" w:cs="Arial"/>
-                                      <w:b/>
-                                      <w:bCs/>
-                                      <w:sz w:val="20"/>
-                                      <w:szCs w:val="20"/>
-                                    </w:rPr>
-                                    <w:t>Ben Van Calster</w:t>
-                                  </w:r>
                                 </w:p>
                                 <w:p>
                                   <w:pPr>
@@ -953,43 +1590,7 @@
                                       <w:sz w:val="20"/>
                                       <w:szCs w:val="20"/>
                                     </w:rPr>
-                                    <w:t xml:space="preserve">: </w:t>
-                                  </w:r>
-                                  <w:r>
-                                    <w:rPr>
-                                      <w:rFonts w:ascii="Arial" w:hAnsi="Arial" w:cs="Arial"/>
-                                      <w:sz w:val="20"/>
-                                      <w:szCs w:val="20"/>
-                                    </w:rPr>
-                                    <w:t xml:space="preserve">                     </w:t>
-                                  </w:r>
-                                  <w:r>
-                                    <w:rPr>
-                                      <w:rFonts w:ascii="Arial" w:hAnsi="Arial" w:cs="Arial"/>
-                                      <w:b/>
-                                      <w:bCs/>
-                                      <w:sz w:val="20"/>
-                                      <w:szCs w:val="20"/>
-                                    </w:rPr>
-                                    <w:t>Prof.</w:t>
-                                  </w:r>
-                                  <w:r>
-                                    <w:rPr>
-                                      <w:rFonts w:ascii="Arial" w:hAnsi="Arial" w:cs="Arial"/>
-                                      <w:sz w:val="20"/>
-                                      <w:szCs w:val="20"/>
-                                    </w:rPr>
-                                    <w:t xml:space="preserve"> </w:t>
-                                  </w:r>
-                                  <w:r>
-                                    <w:rPr>
-                                      <w:rFonts w:ascii="Arial" w:hAnsi="Arial" w:cs="Arial"/>
-                                      <w:b/>
-                                      <w:bCs/>
-                                      <w:sz w:val="20"/>
-                                      <w:szCs w:val="20"/>
-                                    </w:rPr>
-                                    <w:t>Laure Wynants</w:t>
+                                    <w:t>:</w:t>
                                   </w:r>
                                 </w:p>
                                 <w:p>
@@ -1006,43 +1607,7 @@
                                       <w:sz w:val="20"/>
                                       <w:szCs w:val="20"/>
                                     </w:rPr>
-                                    <w:t xml:space="preserve">Co-supervisor: </w:t>
-                                  </w:r>
-                                  <w:r>
-                                    <w:rPr>
-                                      <w:rFonts w:ascii="Arial" w:hAnsi="Arial" w:cs="Arial"/>
-                                      <w:sz w:val="20"/>
-                                      <w:szCs w:val="20"/>
-                                    </w:rPr>
-                                    <w:t xml:space="preserve">                     </w:t>
-                                  </w:r>
-                                  <w:r>
-                                    <w:rPr>
-                                      <w:rFonts w:ascii="Arial" w:hAnsi="Arial" w:cs="Arial"/>
-                                      <w:b/>
-                                      <w:bCs/>
-                                      <w:sz w:val="20"/>
-                                      <w:szCs w:val="20"/>
-                                    </w:rPr>
-                                    <w:t>Prof.</w:t>
-                                  </w:r>
-                                  <w:r>
-                                    <w:rPr>
-                                      <w:rFonts w:ascii="Arial" w:hAnsi="Arial" w:cs="Arial"/>
-                                      <w:sz w:val="20"/>
-                                      <w:szCs w:val="20"/>
-                                    </w:rPr>
-                                    <w:t xml:space="preserve"> </w:t>
-                                  </w:r>
-                                  <w:r>
-                                    <w:rPr>
-                                      <w:rFonts w:ascii="Arial" w:hAnsi="Arial" w:cs="Arial"/>
-                                      <w:b/>
-                                      <w:bCs/>
-                                      <w:sz w:val="20"/>
-                                      <w:szCs w:val="20"/>
-                                    </w:rPr>
-                                    <w:t>Dirk Timmerman</w:t>
+                                    <w:t>Co-supervisor:</w:t>
                                   </w:r>
                                 </w:p>
                                 <w:p>
@@ -1077,54 +1642,6 @@
                                     </w:rPr>
                                     <w:t>:</w:t>
                                   </w:r>
-                                  <w:r>
-                                    <w:rPr>
-                                      <w:rFonts w:ascii="Arial" w:hAnsi="Arial" w:cs="Arial"/>
-                                      <w:sz w:val="20"/>
-                                      <w:szCs w:val="20"/>
-                                    </w:rPr>
-                                    <w:t xml:space="preserve"> </w:t>
-                                  </w:r>
-                                  <w:r>
-                                    <w:rPr>
-                                      <w:rFonts w:ascii="Arial" w:hAnsi="Arial" w:cs="Arial"/>
-                                      <w:b/>
-                                      <w:bCs/>
-                                      <w:sz w:val="20"/>
-                                      <w:szCs w:val="20"/>
-                                    </w:rPr>
-                                    <w:t>Prof.</w:t>
-                                  </w:r>
-                                  <w:r>
-                                    <w:rPr>
-                                      <w:rFonts w:ascii="Arial" w:hAnsi="Arial" w:cs="Arial"/>
-                                      <w:sz w:val="20"/>
-                                      <w:szCs w:val="20"/>
-                                    </w:rPr>
-                                    <w:t xml:space="preserve"> </w:t>
-                                  </w:r>
-                                  <w:r>
-                                    <w:rPr>
-                                      <w:rFonts w:ascii="Arial" w:hAnsi="Arial" w:cs="Arial"/>
-                                      <w:b/>
-                                      <w:bCs/>
-                                      <w:sz w:val="20"/>
-                                      <w:szCs w:val="20"/>
-                                    </w:rPr>
-                                    <w:t xml:space="preserve">An </w:t>
-                                  </w:r>
-                                  <w:proofErr w:type="spellStart"/>
-                                  <w:r>
-                                    <w:rPr>
-                                      <w:rFonts w:ascii="Arial" w:hAnsi="Arial" w:cs="Arial"/>
-                                      <w:b/>
-                                      <w:bCs/>
-                                      <w:sz w:val="20"/>
-                                      <w:szCs w:val="20"/>
-                                    </w:rPr>
-                                    <w:t>Coosemans</w:t>
-                                  </w:r>
-                                  <w:proofErr w:type="spellEnd"/>
                                 </w:p>
                                 <w:p>
                                   <w:pPr>
@@ -1160,50 +1677,6 @@
                                     </w:rPr>
                                     <w:t>:</w:t>
                                   </w:r>
-                                  <w:r>
-                                    <w:rPr>
-                                      <w:rFonts w:ascii="Arial" w:hAnsi="Arial" w:cs="Arial"/>
-                                      <w:sz w:val="20"/>
-                                      <w:szCs w:val="20"/>
-                                    </w:rPr>
-                                    <w:t xml:space="preserve"> </w:t>
-                                  </w:r>
-                                  <w:r>
-                                    <w:rPr>
-                                      <w:rFonts w:ascii="Arial" w:hAnsi="Arial" w:cs="Arial"/>
-                                      <w:sz w:val="20"/>
-                                      <w:szCs w:val="20"/>
-                                    </w:rPr>
-                                    <w:t xml:space="preserve">           </w:t>
-                                  </w:r>
-                                  <w:r>
-                                    <w:rPr>
-                                      <w:rFonts w:ascii="Arial" w:hAnsi="Arial" w:cs="Arial"/>
-                                      <w:b/>
-                                      <w:bCs/>
-                                      <w:sz w:val="20"/>
-                                      <w:szCs w:val="20"/>
-                                    </w:rPr>
-                                    <w:t>Prof.</w:t>
-                                  </w:r>
-                                  <w:r>
-                                    <w:rPr>
-                                      <w:rFonts w:ascii="Arial" w:hAnsi="Arial" w:cs="Arial"/>
-                                      <w:sz w:val="20"/>
-                                      <w:szCs w:val="20"/>
-                                    </w:rPr>
-                                    <w:t xml:space="preserve"> </w:t>
-                                  </w:r>
-                                  <w:r>
-                                    <w:rPr>
-                                      <w:rFonts w:ascii="Arial" w:hAnsi="Arial" w:cs="Arial"/>
-                                      <w:b/>
-                                      <w:bCs/>
-                                      <w:sz w:val="20"/>
-                                      <w:szCs w:val="20"/>
-                                    </w:rPr>
-                                    <w:t>Rik Lories</w:t>
-                                  </w:r>
                                 </w:p>
                                 <w:p>
                                   <w:pPr>
@@ -1229,190 +1702,7 @@
                                       <w:sz w:val="20"/>
                                       <w:szCs w:val="20"/>
                                     </w:rPr>
-                                    <w:t xml:space="preserve">: </w:t>
-                                  </w:r>
-                                  <w:r>
-                                    <w:rPr>
-                                      <w:rFonts w:ascii="Arial" w:hAnsi="Arial" w:cs="Arial"/>
-                                      <w:sz w:val="20"/>
-                                      <w:szCs w:val="20"/>
-                                    </w:rPr>
-                                    <w:t xml:space="preserve">                     </w:t>
-                                  </w:r>
-                                  <w:r>
-                                    <w:rPr>
-                                      <w:rFonts w:ascii="Arial" w:hAnsi="Arial" w:cs="Arial"/>
-                                      <w:b/>
-                                      <w:bCs/>
-                                      <w:sz w:val="20"/>
-                                      <w:szCs w:val="20"/>
-                                    </w:rPr>
-                                    <w:t xml:space="preserve">Prof. </w:t>
-                                  </w:r>
-                                  <w:r>
-                                    <w:rPr>
-                                      <w:rFonts w:ascii="Arial" w:hAnsi="Arial" w:cs="Arial"/>
-                                      <w:b/>
-                                      <w:bCs/>
-                                      <w:sz w:val="20"/>
-                                      <w:szCs w:val="20"/>
-                                    </w:rPr>
-                                    <w:t>Thomas Debray</w:t>
-                                  </w:r>
-                                </w:p>
-                                <w:p>
-                                  <w:pPr>
-                                    <w:ind w:firstLine="1276"/>
-                                    <w:rPr>
-                                      <w:rFonts w:ascii="Arial" w:hAnsi="Arial" w:cs="Arial"/>
-                                      <w:b/>
-                                      <w:bCs/>
-                                      <w:sz w:val="20"/>
-                                      <w:szCs w:val="20"/>
-                                    </w:rPr>
-                                  </w:pPr>
-                                  <w:r>
-                                    <w:rPr>
-                                      <w:rFonts w:ascii="Arial" w:hAnsi="Arial" w:cs="Arial"/>
-                                      <w:b/>
-                                      <w:bCs/>
-                                      <w:sz w:val="20"/>
-                                      <w:szCs w:val="20"/>
-                                    </w:rPr>
-                                    <w:t xml:space="preserve">  </w:t>
-                                  </w:r>
-                                  <w:r>
-                                    <w:rPr>
-                                      <w:rFonts w:ascii="Arial" w:hAnsi="Arial" w:cs="Arial"/>
-                                      <w:b/>
-                                      <w:bCs/>
-                                      <w:sz w:val="20"/>
-                                      <w:szCs w:val="20"/>
-                                    </w:rPr>
-                                    <w:t xml:space="preserve">                     </w:t>
-                                  </w:r>
-                                  <w:r>
-                                    <w:rPr>
-                                      <w:rFonts w:ascii="Arial" w:hAnsi="Arial" w:cs="Arial"/>
-                                      <w:b/>
-                                      <w:bCs/>
-                                      <w:sz w:val="20"/>
-                                      <w:szCs w:val="20"/>
-                                    </w:rPr>
-                                    <w:t>P</w:t>
-                                  </w:r>
-                                  <w:r>
-                                    <w:rPr>
-                                      <w:rFonts w:ascii="Arial" w:hAnsi="Arial" w:cs="Arial"/>
-                                      <w:b/>
-                                      <w:bCs/>
-                                      <w:sz w:val="20"/>
-                                      <w:szCs w:val="20"/>
-                                    </w:rPr>
-                                    <w:t>rof. Peggy Geomini</w:t>
-                                  </w:r>
-                                </w:p>
-                                <w:p>
-                                  <w:pPr>
-                                    <w:ind w:firstLine="1276"/>
-                                    <w:rPr>
-                                      <w:rFonts w:ascii="Arial" w:hAnsi="Arial" w:cs="Arial"/>
-                                      <w:b/>
-                                      <w:bCs/>
-                                      <w:sz w:val="20"/>
-                                      <w:szCs w:val="20"/>
-                                      <w:lang w:val="nl-BE"/>
-                                    </w:rPr>
-                                  </w:pPr>
-                                  <w:r>
-                                    <w:rPr>
-                                      <w:rFonts w:ascii="Arial" w:hAnsi="Arial" w:cs="Arial"/>
-                                      <w:b/>
-                                      <w:bCs/>
-                                      <w:sz w:val="20"/>
-                                      <w:szCs w:val="20"/>
-                                      <w:lang w:val="en-GB"/>
-                                    </w:rPr>
-                                    <w:t xml:space="preserve">  </w:t>
-                                  </w:r>
-                                  <w:r>
-                                    <w:rPr>
-                                      <w:rFonts w:ascii="Arial" w:hAnsi="Arial" w:cs="Arial"/>
-                                      <w:b/>
-                                      <w:bCs/>
-                                      <w:sz w:val="20"/>
-                                      <w:szCs w:val="20"/>
-                                      <w:lang w:val="en-GB"/>
-                                    </w:rPr>
-                                    <w:t xml:space="preserve">                     </w:t>
-                                  </w:r>
-                                  <w:r>
-                                    <w:rPr>
-                                      <w:rFonts w:ascii="Arial" w:hAnsi="Arial" w:cs="Arial"/>
-                                      <w:b/>
-                                      <w:bCs/>
-                                      <w:sz w:val="20"/>
-                                      <w:szCs w:val="20"/>
-                                      <w:lang w:val="nl-BE"/>
-                                    </w:rPr>
-                                    <w:t>Prof. Celine Vens</w:t>
-                                  </w:r>
-                                </w:p>
-                                <w:p>
-                                  <w:pPr>
-                                    <w:ind w:firstLine="1276"/>
-                                    <w:rPr>
-                                      <w:rFonts w:ascii="Arial" w:hAnsi="Arial" w:cs="Arial"/>
-                                      <w:b/>
-                                      <w:bCs/>
-                                      <w:sz w:val="20"/>
-                                      <w:szCs w:val="20"/>
-                                      <w:lang w:val="nl-BE"/>
-                                    </w:rPr>
-                                  </w:pPr>
-                                  <w:r>
-                                    <w:rPr>
-                                      <w:rFonts w:ascii="Arial" w:hAnsi="Arial" w:cs="Arial"/>
-                                      <w:b/>
-                                      <w:bCs/>
-                                      <w:sz w:val="20"/>
-                                      <w:szCs w:val="20"/>
-                                      <w:lang w:val="nl-BE"/>
-                                    </w:rPr>
-                                    <w:t xml:space="preserve">  </w:t>
-                                  </w:r>
-                                  <w:r>
-                                    <w:rPr>
-                                      <w:rFonts w:ascii="Arial" w:hAnsi="Arial" w:cs="Arial"/>
-                                      <w:b/>
-                                      <w:bCs/>
-                                      <w:sz w:val="20"/>
-                                      <w:szCs w:val="20"/>
-                                      <w:lang w:val="nl-BE"/>
-                                    </w:rPr>
-                                    <w:t xml:space="preserve"> </w:t>
-                                  </w:r>
-                                  <w:r>
-                                    <w:rPr>
-                                      <w:rFonts w:ascii="Arial" w:hAnsi="Arial" w:cs="Arial"/>
-                                      <w:b/>
-                                      <w:bCs/>
-                                      <w:sz w:val="20"/>
-                                      <w:szCs w:val="20"/>
-                                      <w:lang w:val="nl-BE"/>
-                                    </w:rPr>
-                                    <w:t xml:space="preserve">                    </w:t>
-                                  </w:r>
-                                  <w:r>
-                                    <w:rPr>
-                                      <w:rFonts w:ascii="Arial" w:hAnsi="Arial" w:cs="Arial"/>
-                                      <w:b/>
-                                      <w:bCs/>
-                                      <w:sz w:val="20"/>
-                                      <w:szCs w:val="20"/>
-                                      <w:lang w:val="nl-BE"/>
-                                    </w:rPr>
-                                    <w:t>Prof. Thierry Van den Bosch</w:t>
+                                    <w:t>:</w:t>
                                   </w:r>
                                 </w:p>
                               </w:txbxContent>
@@ -1434,7 +1724,7 @@
                 </mc:Choice>
                 <mc:Fallback>
                   <w:pict>
-                    <v:shape w14:anchorId="1AC28B9D" id="Text Box 79" o:spid="_x0000_s1030" type="#_x0000_t202" style="position:absolute;margin-left:25.75pt;margin-top:409.8pt;width:279.45pt;height:138pt;z-index:251658244;visibility:visible;mso-wrap-style:square;mso-width-percent:0;mso-height-percent:0;mso-wrap-distance-left:9pt;mso-wrap-distance-top:0;mso-wrap-distance-right:9pt;mso-wrap-distance-bottom:0;mso-position-horizontal:absolute;mso-position-horizontal-relative:text;mso-position-vertical:absolute;mso-position-vertical-relative:text;mso-width-percent:0;mso-height-percent:0;mso-width-relative:page;mso-height-relative:page;v-text-anchor:top" o:gfxdata="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" filled="f" stroked="f">
+                    <v:shape w14:anchorId="1AC28B9D" id="Text Box 79" o:spid="_x0000_s1031" type="#_x0000_t202" style="position:absolute;margin-left:25.75pt;margin-top:409.8pt;width:279.45pt;height:138pt;z-index:251658244;visibility:visible;mso-wrap-style:square;mso-width-percent:0;mso-height-percent:0;mso-wrap-distance-left:9pt;mso-wrap-distance-top:0;mso-wrap-distance-right:9pt;mso-wrap-distance-bottom:0;mso-position-horizontal:absolute;mso-position-horizontal-relative:text;mso-position-vertical:absolute;mso-position-vertical-relative:text;mso-width-percent:0;mso-height-percent:0;mso-width-relative:page;mso-height-relative:page;v-text-anchor:top" o:gfxdata="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" filled="f" stroked="f">
                       <v:textbox>
                         <w:txbxContent>
                           <w:p>
@@ -1496,50 +1786,6 @@
                               </w:rPr>
                               <w:t>r:</w:t>
                             </w:r>
-                            <w:r>
-                              <w:rPr>
-                                <w:rFonts w:ascii="Arial" w:hAnsi="Arial" w:cs="Arial"/>
-                                <w:sz w:val="20"/>
-                                <w:szCs w:val="20"/>
-                              </w:rPr>
-                              <w:t xml:space="preserve"> </w:t>
-                            </w:r>
-                            <w:r>
-                              <w:rPr>
-                                <w:rFonts w:ascii="Arial" w:hAnsi="Arial" w:cs="Arial"/>
-                                <w:sz w:val="20"/>
-                                <w:szCs w:val="20"/>
-                              </w:rPr>
-                              <w:t xml:space="preserve">                          </w:t>
-                            </w:r>
-                            <w:r>
-                              <w:rPr>
-                                <w:rFonts w:ascii="Arial" w:hAnsi="Arial" w:cs="Arial"/>
-                                <w:b/>
-                                <w:bCs/>
-                                <w:sz w:val="20"/>
-                                <w:szCs w:val="20"/>
-                              </w:rPr>
-                              <w:t>Prof.</w:t>
-                            </w:r>
-                            <w:r>
-                              <w:rPr>
-                                <w:rFonts w:ascii="Arial" w:hAnsi="Arial" w:cs="Arial"/>
-                                <w:sz w:val="20"/>
-                                <w:szCs w:val="20"/>
-                              </w:rPr>
-                              <w:t xml:space="preserve"> </w:t>
-                            </w:r>
-                            <w:r>
-                              <w:rPr>
-                                <w:rFonts w:ascii="Arial" w:hAnsi="Arial" w:cs="Arial"/>
-                                <w:b/>
-                                <w:bCs/>
-                                <w:sz w:val="20"/>
-                                <w:szCs w:val="20"/>
-                              </w:rPr>
-                              <w:t>Ben Van Calster</w:t>
-                            </w:r>
                           </w:p>
                           <w:p>
                             <w:pPr>
@@ -1573,43 +1819,7 @@
                                 <w:sz w:val="20"/>
                                 <w:szCs w:val="20"/>
                               </w:rPr>
-                              <w:t xml:space="preserve">: </w:t>
-                            </w:r>
-                            <w:r>
-                              <w:rPr>
-                                <w:rFonts w:ascii="Arial" w:hAnsi="Arial" w:cs="Arial"/>
-                                <w:sz w:val="20"/>
-                                <w:szCs w:val="20"/>
-                              </w:rPr>
-                              <w:t xml:space="preserve">                     </w:t>
-                            </w:r>
-                            <w:r>
-                              <w:rPr>
-                                <w:rFonts w:ascii="Arial" w:hAnsi="Arial" w:cs="Arial"/>
-                                <w:b/>
-                                <w:bCs/>
-                                <w:sz w:val="20"/>
-                                <w:szCs w:val="20"/>
-                              </w:rPr>
-                              <w:t>Prof.</w:t>
-                            </w:r>
-                            <w:r>
-                              <w:rPr>
-                                <w:rFonts w:ascii="Arial" w:hAnsi="Arial" w:cs="Arial"/>
-                                <w:sz w:val="20"/>
-                                <w:szCs w:val="20"/>
-                              </w:rPr>
-                              <w:t xml:space="preserve"> </w:t>
-                            </w:r>
-                            <w:r>
-                              <w:rPr>
-                                <w:rFonts w:ascii="Arial" w:hAnsi="Arial" w:cs="Arial"/>
-                                <w:b/>
-                                <w:bCs/>
-                                <w:sz w:val="20"/>
-                                <w:szCs w:val="20"/>
-                              </w:rPr>
-                              <w:t>Laure Wynants</w:t>
+                              <w:t>:</w:t>
                             </w:r>
                           </w:p>
                           <w:p>
@@ -1626,43 +1836,7 @@
                                 <w:sz w:val="20"/>
                                 <w:szCs w:val="20"/>
                               </w:rPr>
-                              <w:t xml:space="preserve">Co-supervisor: </w:t>
-                            </w:r>
-                            <w:r>
-                              <w:rPr>
-                                <w:rFonts w:ascii="Arial" w:hAnsi="Arial" w:cs="Arial"/>
-                                <w:sz w:val="20"/>
-                                <w:szCs w:val="20"/>
-                              </w:rPr>
-                              <w:t xml:space="preserve">                     </w:t>
-                            </w:r>
-                            <w:r>
-                              <w:rPr>
-                                <w:rFonts w:ascii="Arial" w:hAnsi="Arial" w:cs="Arial"/>
-                                <w:b/>
-                                <w:bCs/>
-                                <w:sz w:val="20"/>
-                                <w:szCs w:val="20"/>
-                              </w:rPr>
-                              <w:t>Prof.</w:t>
-                            </w:r>
-                            <w:r>
-                              <w:rPr>
-                                <w:rFonts w:ascii="Arial" w:hAnsi="Arial" w:cs="Arial"/>
-                                <w:sz w:val="20"/>
-                                <w:szCs w:val="20"/>
-                              </w:rPr>
-                              <w:t xml:space="preserve"> </w:t>
-                            </w:r>
-                            <w:r>
-                              <w:rPr>
-                                <w:rFonts w:ascii="Arial" w:hAnsi="Arial" w:cs="Arial"/>
-                                <w:b/>
-                                <w:bCs/>
-                                <w:sz w:val="20"/>
-                                <w:szCs w:val="20"/>
-                              </w:rPr>
-                              <w:t>Dirk Timmerman</w:t>
+                              <w:t>Co-supervisor:</w:t>
                             </w:r>
                           </w:p>
                           <w:p>
@@ -1697,54 +1871,6 @@
                               </w:rPr>
                               <w:t>:</w:t>
                             </w:r>
-                            <w:r>
-                              <w:rPr>
-                                <w:rFonts w:ascii="Arial" w:hAnsi="Arial" w:cs="Arial"/>
-                                <w:sz w:val="20"/>
-                                <w:szCs w:val="20"/>
-                              </w:rPr>
-                              <w:t xml:space="preserve"> </w:t>
-                            </w:r>
-                            <w:r>
-                              <w:rPr>
-                                <w:rFonts w:ascii="Arial" w:hAnsi="Arial" w:cs="Arial"/>
-                                <w:b/>
-                                <w:bCs/>
-                                <w:sz w:val="20"/>
-                                <w:szCs w:val="20"/>
-                              </w:rPr>
-                              <w:t>Prof.</w:t>
-                            </w:r>
-                            <w:r>
-                              <w:rPr>
-                                <w:rFonts w:ascii="Arial" w:hAnsi="Arial" w:cs="Arial"/>
-                                <w:sz w:val="20"/>
-                                <w:szCs w:val="20"/>
-                              </w:rPr>
-                              <w:t xml:space="preserve"> </w:t>
-                            </w:r>
-                            <w:r>
-                              <w:rPr>
-                                <w:rFonts w:ascii="Arial" w:hAnsi="Arial" w:cs="Arial"/>
-                                <w:b/>
-                                <w:bCs/>
-                                <w:sz w:val="20"/>
-                                <w:szCs w:val="20"/>
-                              </w:rPr>
-                              <w:t xml:space="preserve">An </w:t>
-                            </w:r>
-                            <w:proofErr w:type="spellStart"/>
-                            <w:r>
-                              <w:rPr>
-                                <w:rFonts w:ascii="Arial" w:hAnsi="Arial" w:cs="Arial"/>
-                                <w:b/>
-                                <w:bCs/>
-                                <w:sz w:val="20"/>
-                                <w:szCs w:val="20"/>
-                              </w:rPr>
-                              <w:t>Coosemans</w:t>
-                            </w:r>
-                            <w:proofErr w:type="spellEnd"/>
                           </w:p>
                           <w:p>
                             <w:pPr>
@@ -1780,50 +1906,6 @@
                               </w:rPr>
                               <w:t>:</w:t>
                             </w:r>
-                            <w:r>
-                              <w:rPr>
-                                <w:rFonts w:ascii="Arial" w:hAnsi="Arial" w:cs="Arial"/>
-                                <w:sz w:val="20"/>
-                                <w:szCs w:val="20"/>
-                              </w:rPr>
-                              <w:t xml:space="preserve"> </w:t>
-                            </w:r>
-                            <w:r>
-                              <w:rPr>
-                                <w:rFonts w:ascii="Arial" w:hAnsi="Arial" w:cs="Arial"/>
-                                <w:sz w:val="20"/>
-                                <w:szCs w:val="20"/>
-                              </w:rPr>
-                              <w:t xml:space="preserve">           </w:t>
-                            </w:r>
-                            <w:r>
-                              <w:rPr>
-                                <w:rFonts w:ascii="Arial" w:hAnsi="Arial" w:cs="Arial"/>
-                                <w:b/>
-                                <w:bCs/>
-                                <w:sz w:val="20"/>
-                                <w:szCs w:val="20"/>
-                              </w:rPr>
-                              <w:t>Prof.</w:t>
-                            </w:r>
-                            <w:r>
-                              <w:rPr>
-                                <w:rFonts w:ascii="Arial" w:hAnsi="Arial" w:cs="Arial"/>
-                                <w:sz w:val="20"/>
-                                <w:szCs w:val="20"/>
-                              </w:rPr>
-                              <w:t xml:space="preserve"> </w:t>
-                            </w:r>
-                            <w:r>
-                              <w:rPr>
-                                <w:rFonts w:ascii="Arial" w:hAnsi="Arial" w:cs="Arial"/>
-                                <w:b/>
-                                <w:bCs/>
-                                <w:sz w:val="20"/>
-                                <w:szCs w:val="20"/>
-                              </w:rPr>
-                              <w:t>Rik Lories</w:t>
-                            </w:r>
                           </w:p>
                           <w:p>
                             <w:pPr>
@@ -1849,190 +1931,7 @@
                                 <w:sz w:val="20"/>
                                 <w:szCs w:val="20"/>
                               </w:rPr>
-                              <w:t xml:space="preserve">: </w:t>
-                            </w:r>
-                            <w:r>
-                              <w:rPr>
-                                <w:rFonts w:ascii="Arial" w:hAnsi="Arial" w:cs="Arial"/>
-                                <w:sz w:val="20"/>
-                                <w:szCs w:val="20"/>
-                              </w:rPr>
-                              <w:t xml:space="preserve">                     </w:t>
-                            </w:r>
-                            <w:r>
-                              <w:rPr>
-                                <w:rFonts w:ascii="Arial" w:hAnsi="Arial" w:cs="Arial"/>
-                                <w:b/>
-                                <w:bCs/>
-                                <w:sz w:val="20"/>
-                                <w:szCs w:val="20"/>
-                              </w:rPr>
-                              <w:t xml:space="preserve">Prof. </w:t>
-                            </w:r>
-                            <w:r>
-                              <w:rPr>
-                                <w:rFonts w:ascii="Arial" w:hAnsi="Arial" w:cs="Arial"/>
-                                <w:b/>
-                                <w:bCs/>
-                                <w:sz w:val="20"/>
-                                <w:szCs w:val="20"/>
-                              </w:rPr>
-                              <w:t>Thomas Debray</w:t>
-                            </w:r>
-                          </w:p>
-                          <w:p>
-                            <w:pPr>
-                              <w:ind w:firstLine="1276"/>
-                              <w:rPr>
-                                <w:rFonts w:ascii="Arial" w:hAnsi="Arial" w:cs="Arial"/>
-                                <w:b/>
-                                <w:bCs/>
-                                <w:sz w:val="20"/>
-                                <w:szCs w:val="20"/>
-                              </w:rPr>
-                            </w:pPr>
-                            <w:r>
-                              <w:rPr>
-                                <w:rFonts w:ascii="Arial" w:hAnsi="Arial" w:cs="Arial"/>
-                                <w:b/>
-                                <w:bCs/>
-                                <w:sz w:val="20"/>
-                                <w:szCs w:val="20"/>
-                              </w:rPr>
-                              <w:t xml:space="preserve">  </w:t>
-                            </w:r>
-                            <w:r>
-                              <w:rPr>
-                                <w:rFonts w:ascii="Arial" w:hAnsi="Arial" w:cs="Arial"/>
-                                <w:b/>
-                                <w:bCs/>
-                                <w:sz w:val="20"/>
-                                <w:szCs w:val="20"/>
-                              </w:rPr>
-                              <w:t xml:space="preserve">                     </w:t>
-                            </w:r>
-                            <w:r>
-                              <w:rPr>
-                                <w:rFonts w:ascii="Arial" w:hAnsi="Arial" w:cs="Arial"/>
-                                <w:b/>
-                                <w:bCs/>
-                                <w:sz w:val="20"/>
-                                <w:szCs w:val="20"/>
-                              </w:rPr>
-                              <w:t>P</w:t>
-                            </w:r>
-                            <w:r>
-                              <w:rPr>
-                                <w:rFonts w:ascii="Arial" w:hAnsi="Arial" w:cs="Arial"/>
-                                <w:b/>
-                                <w:bCs/>
-                                <w:sz w:val="20"/>
-                                <w:szCs w:val="20"/>
-                              </w:rPr>
-                              <w:t>rof. Peggy Geomini</w:t>
-                            </w:r>
-                          </w:p>
-                          <w:p>
-                            <w:pPr>
-                              <w:ind w:firstLine="1276"/>
-                              <w:rPr>
-                                <w:rFonts w:ascii="Arial" w:hAnsi="Arial" w:cs="Arial"/>
-                                <w:b/>
-                                <w:bCs/>
-                                <w:sz w:val="20"/>
-                                <w:szCs w:val="20"/>
-                                <w:lang w:val="nl-BE"/>
-                              </w:rPr>
-                            </w:pPr>
-                            <w:r>
-                              <w:rPr>
-                                <w:rFonts w:ascii="Arial" w:hAnsi="Arial" w:cs="Arial"/>
-                                <w:b/>
-                                <w:bCs/>
-                                <w:sz w:val="20"/>
-                                <w:szCs w:val="20"/>
-                                <w:lang w:val="en-GB"/>
-                              </w:rPr>
-                              <w:t xml:space="preserve">  </w:t>
-                            </w:r>
-                            <w:r>
-                              <w:rPr>
-                                <w:rFonts w:ascii="Arial" w:hAnsi="Arial" w:cs="Arial"/>
-                                <w:b/>
-                                <w:bCs/>
-                                <w:sz w:val="20"/>
-                                <w:szCs w:val="20"/>
-                                <w:lang w:val="en-GB"/>
-                              </w:rPr>
-                              <w:t xml:space="preserve">                     </w:t>
-                            </w:r>
-                            <w:r>
-                              <w:rPr>
-                                <w:rFonts w:ascii="Arial" w:hAnsi="Arial" w:cs="Arial"/>
-                                <w:b/>
-                                <w:bCs/>
-                                <w:sz w:val="20"/>
-                                <w:szCs w:val="20"/>
-                                <w:lang w:val="nl-BE"/>
-                              </w:rPr>
-                              <w:t>Prof. Celine Vens</w:t>
-                            </w:r>
-                          </w:p>
-                          <w:p>
-                            <w:pPr>
-                              <w:ind w:firstLine="1276"/>
-                              <w:rPr>
-                                <w:rFonts w:ascii="Arial" w:hAnsi="Arial" w:cs="Arial"/>
-                                <w:b/>
-                                <w:bCs/>
-                                <w:sz w:val="20"/>
-                                <w:szCs w:val="20"/>
-                                <w:lang w:val="nl-BE"/>
-                              </w:rPr>
-                            </w:pPr>
-                            <w:r>
-                              <w:rPr>
-                                <w:rFonts w:ascii="Arial" w:hAnsi="Arial" w:cs="Arial"/>
-                                <w:b/>
-                                <w:bCs/>
-                                <w:sz w:val="20"/>
-                                <w:szCs w:val="20"/>
-                                <w:lang w:val="nl-BE"/>
-                              </w:rPr>
-                              <w:t xml:space="preserve">  </w:t>
-                            </w:r>
-                            <w:r>
-                              <w:rPr>
-                                <w:rFonts w:ascii="Arial" w:hAnsi="Arial" w:cs="Arial"/>
-                                <w:b/>
-                                <w:bCs/>
-                                <w:sz w:val="20"/>
-                                <w:szCs w:val="20"/>
-                                <w:lang w:val="nl-BE"/>
-                              </w:rPr>
-                              <w:t xml:space="preserve"> </w:t>
-                            </w:r>
-                            <w:r>
-                              <w:rPr>
-                                <w:rFonts w:ascii="Arial" w:hAnsi="Arial" w:cs="Arial"/>
-                                <w:b/>
-                                <w:bCs/>
-                                <w:sz w:val="20"/>
-                                <w:szCs w:val="20"/>
-                                <w:lang w:val="nl-BE"/>
-                              </w:rPr>
-                              <w:t xml:space="preserve">                    </w:t>
-                            </w:r>
-                            <w:r>
-                              <w:rPr>
-                                <w:rFonts w:ascii="Arial" w:hAnsi="Arial" w:cs="Arial"/>
-                                <w:b/>
-                                <w:bCs/>
-                                <w:sz w:val="20"/>
-                                <w:szCs w:val="20"/>
-                                <w:lang w:val="nl-BE"/>
-                              </w:rPr>
-                              <w:t>Prof. Thierry Van den Bosch</w:t>
+                              <w:t>:</w:t>
                             </w:r>
                           </w:p>
                         </w:txbxContent>
@@ -2169,7 +2068,7 @@
                 </mc:Choice>
                 <mc:Fallback>
                   <w:pict>
-                    <v:shape w14:anchorId="74CACCDB" id="Text Box 77" o:spid="_x0000_s1031" type="#_x0000_t202" style="position:absolute;margin-left:306pt;margin-top:426.6pt;width:135pt;height:1in;z-index:251658242;visibility:visible;mso-wrap-style:square;mso-width-percent:0;mso-height-percent:0;mso-wrap-distance-left:9pt;mso-wrap-distance-top:0;mso-wrap-distance-right:9pt;mso-wrap-distance-bottom:0;mso-position-horizontal:absolute;mso-position-horizontal-relative:text;mso-position-vertical:absolute;mso-position-vertical-relative:text;mso-width-percent:0;mso-height-percent:0;mso-width-relative:page;mso-height-relative:page;v-text-anchor:top" o:gfxdata="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" filled="f" stroked="f">
+                    <v:shape w14:anchorId="74CACCDB" id="Text Box 77" o:spid="_x0000_s1032" type="#_x0000_t202" style="position:absolute;margin-left:306pt;margin-top:426.6pt;width:135pt;height:1in;z-index:251658242;visibility:visible;mso-wrap-style:square;mso-width-percent:0;mso-height-percent:0;mso-wrap-distance-left:9pt;mso-wrap-distance-top:0;mso-wrap-distance-right:9pt;mso-wrap-distance-bottom:0;mso-position-horizontal:absolute;mso-position-horizontal-relative:text;mso-position-vertical:absolute;mso-position-vertical-relative:text;mso-width-percent:0;mso-height-percent:0;mso-width-relative:page;mso-height-relative:page;v-text-anchor:top" o:gfxdata="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" filled="f" stroked="f">
                       <v:textbox>
                         <w:txbxContent>
                           <w:p>
@@ -2674,6 +2573,7 @@
   <w:style w:type="paragraph" w:default="1" w:styleId="Normal">
     <w:name w:val="Normal"/>
     <w:qFormat/>
+    <w:rsid w:val="00054AEE"/>
     <w:rPr>
       <w:sz w:val="24"/>
       <w:szCs w:val="24"/>

</xml_diff>

<commit_message>
Update title page to replace Prof. Rik Lories with Prof. Annick Bogaerts
</commit_message>
<xml_diff>
--- a/title_page/title_page.docx
+++ b/title_page/title_page.docx
@@ -695,12 +695,40 @@
                                   <w:r>
                                     <w:rPr>
                                       <w:rFonts w:ascii="Arial" w:hAnsi="Arial" w:cs="Arial"/>
+                                      <w:sz w:val="20"/>
+                                      <w:szCs w:val="20"/>
+                                    </w:rPr>
+                                    <w:t>A</w:t>
+                                  </w:r>
+                                  <w:r>
+                                    <w:rPr>
+                                      <w:rFonts w:ascii="Arial" w:hAnsi="Arial" w:cs="Arial"/>
                                       <w:b/>
                                       <w:bCs/>
                                       <w:sz w:val="20"/>
                                       <w:szCs w:val="20"/>
                                     </w:rPr>
-                                    <w:t>Rik Lories</w:t>
+                                    <w:t>nnick</w:t>
+                                  </w:r>
+                                  <w:r>
+                                    <w:rPr>
+                                      <w:rFonts w:ascii="Arial" w:hAnsi="Arial" w:cs="Arial"/>
+                                      <w:b/>
+                                      <w:bCs/>
+                                      <w:sz w:val="20"/>
+                                      <w:szCs w:val="20"/>
+                                    </w:rPr>
+                                    <w:t xml:space="preserve"> B</w:t>
+                                  </w:r>
+                                  <w:r>
+                                    <w:rPr>
+                                      <w:rFonts w:ascii="Arial" w:hAnsi="Arial" w:cs="Arial"/>
+                                      <w:b/>
+                                      <w:bCs/>
+                                      <w:sz w:val="20"/>
+                                      <w:szCs w:val="20"/>
+                                    </w:rPr>
+                                    <w:t>ogaerts</w:t>
                                   </w:r>
                                 </w:p>
                                 <w:p>
@@ -1024,12 +1052,40 @@
                             <w:r>
                               <w:rPr>
                                 <w:rFonts w:ascii="Arial" w:hAnsi="Arial" w:cs="Arial"/>
+                                <w:sz w:val="20"/>
+                                <w:szCs w:val="20"/>
+                              </w:rPr>
+                              <w:t>A</w:t>
+                            </w:r>
+                            <w:r>
+                              <w:rPr>
+                                <w:rFonts w:ascii="Arial" w:hAnsi="Arial" w:cs="Arial"/>
                                 <w:b/>
                                 <w:bCs/>
                                 <w:sz w:val="20"/>
                                 <w:szCs w:val="20"/>
                               </w:rPr>
-                              <w:t>Rik Lories</w:t>
+                              <w:t>nnick</w:t>
+                            </w:r>
+                            <w:r>
+                              <w:rPr>
+                                <w:rFonts w:ascii="Arial" w:hAnsi="Arial" w:cs="Arial"/>
+                                <w:b/>
+                                <w:bCs/>
+                                <w:sz w:val="20"/>
+                                <w:szCs w:val="20"/>
+                              </w:rPr>
+                              <w:t xml:space="preserve"> B</w:t>
+                            </w:r>
+                            <w:r>
+                              <w:rPr>
+                                <w:rFonts w:ascii="Arial" w:hAnsi="Arial" w:cs="Arial"/>
+                                <w:b/>
+                                <w:bCs/>
+                                <w:sz w:val="20"/>
+                                <w:szCs w:val="20"/>
+                              </w:rPr>
+                              <w:t>ogaerts</w:t>
                             </w:r>
                           </w:p>
                           <w:p>

</xml_diff>

<commit_message>
Add main.pdf to the repository
</commit_message>
<xml_diff>
--- a/title_page/title_page.docx
+++ b/title_page/title_page.docx
@@ -695,20 +695,22 @@
                                   <w:r>
                                     <w:rPr>
                                       <w:rFonts w:ascii="Arial" w:hAnsi="Arial" w:cs="Arial"/>
-                                      <w:sz w:val="20"/>
-                                      <w:szCs w:val="20"/>
-                                    </w:rPr>
-                                    <w:t>A</w:t>
-                                  </w:r>
-                                  <w:r>
-                                    <w:rPr>
-                                      <w:rFonts w:ascii="Arial" w:hAnsi="Arial" w:cs="Arial"/>
                                       <w:b/>
                                       <w:bCs/>
                                       <w:sz w:val="20"/>
                                       <w:szCs w:val="20"/>
                                     </w:rPr>
-                                    <w:t>nnick</w:t>
+                                    <w:t>Ann</w:t>
+                                  </w:r>
+                                  <w:r>
+                                    <w:rPr>
+                                      <w:rFonts w:ascii="Arial" w:hAnsi="Arial" w:cs="Arial"/>
+                                      <w:b/>
+                                      <w:bCs/>
+                                      <w:sz w:val="20"/>
+                                      <w:szCs w:val="20"/>
+                                    </w:rPr>
+                                    <w:t>ick</w:t>
                                   </w:r>
                                   <w:r>
                                     <w:rPr>
@@ -791,7 +793,7 @@
                                       <w:bCs/>
                                       <w:sz w:val="20"/>
                                       <w:szCs w:val="20"/>
-                                      <w:lang w:val="nl-BE"/>
+                                      <w:lang w:val="en-GB"/>
                                     </w:rPr>
                                   </w:pPr>
                                   <w:r>
@@ -801,7 +803,7 @@
                                       <w:bCs/>
                                       <w:sz w:val="20"/>
                                       <w:szCs w:val="20"/>
-                                      <w:lang w:val="nl-BE"/>
+                                      <w:lang w:val="en-GB"/>
                                     </w:rPr>
                                     <w:t>Prof. Celine Vens</w:t>
                                   </w:r>
@@ -1052,20 +1054,22 @@
                             <w:r>
                               <w:rPr>
                                 <w:rFonts w:ascii="Arial" w:hAnsi="Arial" w:cs="Arial"/>
-                                <w:sz w:val="20"/>
-                                <w:szCs w:val="20"/>
-                              </w:rPr>
-                              <w:t>A</w:t>
-                            </w:r>
-                            <w:r>
-                              <w:rPr>
-                                <w:rFonts w:ascii="Arial" w:hAnsi="Arial" w:cs="Arial"/>
                                 <w:b/>
                                 <w:bCs/>
                                 <w:sz w:val="20"/>
                                 <w:szCs w:val="20"/>
                               </w:rPr>
-                              <w:t>nnick</w:t>
+                              <w:t>Ann</w:t>
+                            </w:r>
+                            <w:r>
+                              <w:rPr>
+                                <w:rFonts w:ascii="Arial" w:hAnsi="Arial" w:cs="Arial"/>
+                                <w:b/>
+                                <w:bCs/>
+                                <w:sz w:val="20"/>
+                                <w:szCs w:val="20"/>
+                              </w:rPr>
+                              <w:t>ick</w:t>
                             </w:r>
                             <w:r>
                               <w:rPr>
@@ -1148,7 +1152,7 @@
                                 <w:bCs/>
                                 <w:sz w:val="20"/>
                                 <w:szCs w:val="20"/>
-                                <w:lang w:val="nl-BE"/>
+                                <w:lang w:val="en-GB"/>
                               </w:rPr>
                             </w:pPr>
                             <w:r>
@@ -1158,7 +1162,7 @@
                                 <w:bCs/>
                                 <w:sz w:val="20"/>
                                 <w:szCs w:val="20"/>
-                                <w:lang w:val="nl-BE"/>
+                                <w:lang w:val="en-GB"/>
                               </w:rPr>
                               <w:t>Prof. Celine Vens</w:t>
                             </w:r>

</xml_diff>

<commit_message>
Remove main.pdf from .gitignore
</commit_message>
<xml_diff>
--- a/title_page/title_page.docx
+++ b/title_page/title_page.docx
@@ -651,20 +651,8 @@
                                       <w:sz w:val="20"/>
                                       <w:szCs w:val="20"/>
                                     </w:rPr>
-                                    <w:t xml:space="preserve">An </w:t>
-                                  </w:r>
-                                  <w:proofErr w:type="spellStart"/>
-                                  <w:r>
-                                    <w:rPr>
-                                      <w:rFonts w:ascii="Arial" w:hAnsi="Arial" w:cs="Arial"/>
-                                      <w:b/>
-                                      <w:bCs/>
-                                      <w:sz w:val="20"/>
-                                      <w:szCs w:val="20"/>
-                                    </w:rPr>
-                                    <w:t>Coosemans</w:t>
-                                  </w:r>
-                                  <w:proofErr w:type="spellEnd"/>
+                                    <w:t>An Coosemans</w:t>
+                                  </w:r>
                                 </w:p>
                                 <w:p>
                                   <w:pPr>
@@ -695,20 +683,22 @@
                                   <w:r>
                                     <w:rPr>
                                       <w:rFonts w:ascii="Arial" w:hAnsi="Arial" w:cs="Arial"/>
-                                      <w:sz w:val="20"/>
-                                      <w:szCs w:val="20"/>
-                                    </w:rPr>
-                                    <w:t>A</w:t>
-                                  </w:r>
-                                  <w:r>
-                                    <w:rPr>
-                                      <w:rFonts w:ascii="Arial" w:hAnsi="Arial" w:cs="Arial"/>
                                       <w:b/>
                                       <w:bCs/>
                                       <w:sz w:val="20"/>
                                       <w:szCs w:val="20"/>
                                     </w:rPr>
-                                    <w:t>nnick</w:t>
+                                    <w:t>An</w:t>
+                                  </w:r>
+                                  <w:r>
+                                    <w:rPr>
+                                      <w:rFonts w:ascii="Arial" w:hAnsi="Arial" w:cs="Arial"/>
+                                      <w:b/>
+                                      <w:bCs/>
+                                      <w:sz w:val="20"/>
+                                      <w:szCs w:val="20"/>
+                                    </w:rPr>
+                                    <w:t>nick</w:t>
                                   </w:r>
                                   <w:r>
                                     <w:rPr>
@@ -1008,20 +998,8 @@
                                 <w:sz w:val="20"/>
                                 <w:szCs w:val="20"/>
                               </w:rPr>
-                              <w:t xml:space="preserve">An </w:t>
-                            </w:r>
-                            <w:proofErr w:type="spellStart"/>
-                            <w:r>
-                              <w:rPr>
-                                <w:rFonts w:ascii="Arial" w:hAnsi="Arial" w:cs="Arial"/>
-                                <w:b/>
-                                <w:bCs/>
-                                <w:sz w:val="20"/>
-                                <w:szCs w:val="20"/>
-                              </w:rPr>
-                              <w:t>Coosemans</w:t>
-                            </w:r>
-                            <w:proofErr w:type="spellEnd"/>
+                              <w:t>An Coosemans</w:t>
+                            </w:r>
                           </w:p>
                           <w:p>
                             <w:pPr>
@@ -1052,20 +1030,22 @@
                             <w:r>
                               <w:rPr>
                                 <w:rFonts w:ascii="Arial" w:hAnsi="Arial" w:cs="Arial"/>
-                                <w:sz w:val="20"/>
-                                <w:szCs w:val="20"/>
-                              </w:rPr>
-                              <w:t>A</w:t>
-                            </w:r>
-                            <w:r>
-                              <w:rPr>
-                                <w:rFonts w:ascii="Arial" w:hAnsi="Arial" w:cs="Arial"/>
                                 <w:b/>
                                 <w:bCs/>
                                 <w:sz w:val="20"/>
                                 <w:szCs w:val="20"/>
                               </w:rPr>
-                              <w:t>nnick</w:t>
+                              <w:t>An</w:t>
+                            </w:r>
+                            <w:r>
+                              <w:rPr>
+                                <w:rFonts w:ascii="Arial" w:hAnsi="Arial" w:cs="Arial"/>
+                                <w:b/>
+                                <w:bCs/>
+                                <w:sz w:val="20"/>
+                                <w:szCs w:val="20"/>
+                              </w:rPr>
+                              <w:t>nick</w:t>
                             </w:r>
                             <w:r>
                               <w:rPr>
@@ -1713,25 +1693,7 @@
                                       <w:sz w:val="20"/>
                                       <w:szCs w:val="20"/>
                                     </w:rPr>
-                                    <w:t xml:space="preserve">Chair public </w:t>
-                                  </w:r>
-                                  <w:proofErr w:type="spellStart"/>
-                                  <w:r>
-                                    <w:rPr>
-                                      <w:rFonts w:ascii="Arial" w:hAnsi="Arial" w:cs="Arial"/>
-                                      <w:sz w:val="20"/>
-                                      <w:szCs w:val="20"/>
-                                    </w:rPr>
-                                    <w:t>defence</w:t>
-                                  </w:r>
-                                  <w:proofErr w:type="spellEnd"/>
-                                  <w:r>
-                                    <w:rPr>
-                                      <w:rFonts w:ascii="Arial" w:hAnsi="Arial" w:cs="Arial"/>
-                                      <w:sz w:val="20"/>
-                                      <w:szCs w:val="20"/>
-                                    </w:rPr>
-                                    <w:t>:</w:t>
+                                    <w:t>Chair public defence:</w:t>
                                   </w:r>
                                 </w:p>
                                 <w:p>
@@ -1942,25 +1904,7 @@
                                 <w:sz w:val="20"/>
                                 <w:szCs w:val="20"/>
                               </w:rPr>
-                              <w:t xml:space="preserve">Chair public </w:t>
-                            </w:r>
-                            <w:proofErr w:type="spellStart"/>
-                            <w:r>
-                              <w:rPr>
-                                <w:rFonts w:ascii="Arial" w:hAnsi="Arial" w:cs="Arial"/>
-                                <w:sz w:val="20"/>
-                                <w:szCs w:val="20"/>
-                              </w:rPr>
-                              <w:t>defence</w:t>
-                            </w:r>
-                            <w:proofErr w:type="spellEnd"/>
-                            <w:r>
-                              <w:rPr>
-                                <w:rFonts w:ascii="Arial" w:hAnsi="Arial" w:cs="Arial"/>
-                                <w:sz w:val="20"/>
-                                <w:szCs w:val="20"/>
-                              </w:rPr>
-                              <w:t>:</w:t>
+                              <w:t>Chair public defence:</w:t>
                             </w:r>
                           </w:p>
                           <w:p>

</xml_diff>